<commit_message>
v6: assembled paper, references pruned to cited-only, Word build
Mechanical verification done: displays numbered continuously and all
referenced in prose, endnotes 1-8 matched one-to-one, abstract 149
words, executive summary 997 words with no citations or displays,
zero em dashes in body prose, seven uncited references pruned.
Factual verification of the fresh prose in progress.

Co-Authored-By: Claude Fable 5 <noreply@anthropic.com>
Claude-Session: https://claude.ai/code/session_01WLCoJ9gmuQFp7YFhChmBui
</commit_message>
<xml_diff>
--- a/build/Former_Teachers_Policy_Paper_v6.docx
+++ b/build/Former_Teachers_Policy_Paper_v6.docx
@@ -11687,7 +11687,7 @@
           <w:sz w:val="21"/>
           <w:szCs w:val="21"/>
         </w:rPr>
-        <w:t xml:space="preserve">Department for Education (2025b), </w:t>
+        <w:t xml:space="preserve">Department of Education (2019), </w:t>
       </w:r>
       <w:r>
         <w:rPr>
@@ -11696,14 +11696,14 @@
           <w:sz w:val="21"/>
           <w:szCs w:val="21"/>
         </w:rPr>
-        <w:t xml:space="preserve">Working Lives of Teachers and Leaders</w:t>
-      </w:r>
-      <w:r>
-        <w:rPr>
-          <w:sz w:val="21"/>
-          <w:szCs w:val="21"/>
-        </w:rPr>
-        <w:t xml:space="preserve"> survey series (2022-2024 waves), Department for Education, London; figures cited as reported in SecEd (2025), "Teachers' working hours fall – to 48.1 a week", https://www.sec-ed.co.uk/content/news/teachers-weekly-working-hours-48-a-week.</w:t>
+        <w:t xml:space="preserve">Circular 0054/2019 – Leave Schemes for Registered Teachers Employed in Recognised Primary and Post Primary Schools</w:t>
+      </w:r>
+      <w:r>
+        <w:rPr>
+          <w:sz w:val="21"/>
+          <w:szCs w:val="21"/>
+        </w:rPr>
+        <w:t xml:space="preserve">, Department of Education, Dublin, https://assets.gov.ie/static/documents/Circular_0054.2019.pdf (accessed on 4 August 2026).</w:t>
       </w:r>
     </w:p>
     <w:p>
@@ -11717,7 +11717,7 @@
           <w:sz w:val="21"/>
           <w:szCs w:val="21"/>
         </w:rPr>
-        <w:t xml:space="preserve">Department of Education (2019), </w:t>
+        <w:t xml:space="preserve">Department of Education and Youth (2025), </w:t>
       </w:r>
       <w:r>
         <w:rPr>
@@ -11726,14 +11726,14 @@
           <w:sz w:val="21"/>
           <w:szCs w:val="21"/>
         </w:rPr>
-        <w:t xml:space="preserve">Circular 0054/2019 – Leave Schemes for Registered Teachers Employed in Recognised Primary and Post Primary Schools</w:t>
-      </w:r>
-      <w:r>
-        <w:rPr>
-          <w:sz w:val="21"/>
-          <w:szCs w:val="21"/>
-        </w:rPr>
-        <w:t xml:space="preserve">, Department of Education, Dublin, https://assets.gov.ie/static/documents/Circular_0054.2019.pdf (accessed on 4 August 2026).</w:t>
+        <w:t xml:space="preserve">Information Note TC/IN 0005/2025 – Temporary changes to the Career Break Scheme for Registered Teachers employed in Recognised Primary and Post Primary Schools – 2025/26 School Year</w:t>
+      </w:r>
+      <w:r>
+        <w:rPr>
+          <w:sz w:val="21"/>
+          <w:szCs w:val="21"/>
+        </w:rPr>
+        <w:t xml:space="preserve">, Department of Education and Youth, Dublin, 26 June 2025, https://assets.gov.ie/static/documents/TC.IN_0005.2025_Information_Note_Career_Break_for_Teachers_25.26_school_year.pdf (accessed on 4 August 2026).</w:t>
       </w:r>
     </w:p>
     <w:p>
@@ -11747,23 +11747,7 @@
           <w:sz w:val="21"/>
           <w:szCs w:val="21"/>
         </w:rPr>
-        <w:t xml:space="preserve">Department of Education and Youth (2025), </w:t>
-      </w:r>
-      <w:r>
-        <w:rPr>
-          <w:i/>
-          <w:iCs/>
-          <w:sz w:val="21"/>
-          <w:szCs w:val="21"/>
-        </w:rPr>
-        <w:t xml:space="preserve">Information Note TC/IN 0005/2025 – Temporary changes to the Career Break Scheme for Registered Teachers employed in Recognised Primary and Post Primary Schools – 2025/26 School Year</w:t>
-      </w:r>
-      <w:r>
-        <w:rPr>
-          <w:sz w:val="21"/>
-          <w:szCs w:val="21"/>
-        </w:rPr>
-        <w:t xml:space="preserve">, Department of Education and Youth, Dublin, 26 June 2025, https://assets.gov.ie/static/documents/TC.IN_0005.2025_Information_Note_Career_Break_for_Teachers_25.26_school_year.pdf (accessed on 4 August 2026).</w:t>
+        <w:t xml:space="preserve">Deutsches Schulportal (2023), "Mehrheit der Länder wirbt gezielt um Lehrkräfte im Pensionsalter" (Länderüberblick survey, 2 August 2023), Robert Bosch Stiftung, https://deutsches-schulportal.de/bildungswesen/laenderueberblick-umfrage-lehrermangel-pensionierte-lehrer/ (accessed on 5 August 2026).</w:t>
       </w:r>
     </w:p>
     <w:p>
@@ -11777,7 +11761,7 @@
           <w:sz w:val="21"/>
           <w:szCs w:val="21"/>
         </w:rPr>
-        <w:t xml:space="preserve">Deutsches Schulportal (2023), "Mehrheit der Länder wirbt gezielt um Lehrkräfte im Pensionsalter" (Länderüberblick survey, 2 August 2023), Robert Bosch Stiftung, https://deutsches-schulportal.de/bildungswesen/laenderueberblick-umfrage-lehrermangel-pensionierte-lehrer/ (accessed on 5 August 2026).</w:t>
+        <w:t xml:space="preserve">Diário de Notícias (2024), "Governo queria 200 professores reformados nas escolas. Regressam 63", dn.pt, 3 December 2024, https://www.dn.pt/5687900830/governo-queria-200-professores-reformados-nas-escolas-regressam-63 (accessed on 4 August 2026).</w:t>
       </w:r>
     </w:p>
     <w:p>
@@ -11791,7 +11775,23 @@
           <w:sz w:val="21"/>
           <w:szCs w:val="21"/>
         </w:rPr>
-        <w:t xml:space="preserve">Diário de Notícias (2024), "Governo queria 200 professores reformados nas escolas. Regressam 63", dn.pt, 3 December 2024, https://www.dn.pt/5687900830/governo-queria-200-professores-reformados-nas-escolas-regressam-63 (accessed on 4 August 2026).</w:t>
+        <w:t xml:space="preserve">European Commission (2023), </w:t>
+      </w:r>
+      <w:r>
+        <w:rPr>
+          <w:i/>
+          <w:iCs/>
+          <w:sz w:val="21"/>
+          <w:szCs w:val="21"/>
+        </w:rPr>
+        <w:t xml:space="preserve">Education and Training Monitor 2023: Comparative Report</w:t>
+      </w:r>
+      <w:r>
+        <w:rPr>
+          <w:sz w:val="21"/>
+          <w:szCs w:val="21"/>
+        </w:rPr>
+        <w:t xml:space="preserve">, Publications Office of the European Union, Luxembourg, https://op.europa.eu/webpub/eac/education-and-training-monitor-2023/ (accessed on 4 August 2026).</w:t>
       </w:r>
     </w:p>
     <w:p>
@@ -11805,7 +11805,23 @@
           <w:sz w:val="21"/>
           <w:szCs w:val="21"/>
         </w:rPr>
-        <w:t xml:space="preserve">DUO (2026), "Stille reserve oud-leraren in het onderwijs afgelopen 10 jaar afgenomen", press release, 28 May 2026, Dienst Uitvoering Onderwijs, https://duo.nl/organisatie/pers/stille-reserve-oud-leraren-in-het-onderwijs-afgelopen-10-jaar-afgenomen.jsp (accessed on 4 August 2026).</w:t>
+        <w:t xml:space="preserve">Feng, L. and T. Sass (2018), "The impact of incentives to recruit and retain teachers in 'hard-to-staff' subjects", </w:t>
+      </w:r>
+      <w:r>
+        <w:rPr>
+          <w:i/>
+          <w:iCs/>
+          <w:sz w:val="21"/>
+          <w:szCs w:val="21"/>
+        </w:rPr>
+        <w:t xml:space="preserve">Journal of Policy Analysis and Management</w:t>
+      </w:r>
+      <w:r>
+        <w:rPr>
+          <w:sz w:val="21"/>
+          <w:szCs w:val="21"/>
+        </w:rPr>
+        <w:t xml:space="preserve">, Vol. 37/1, pp. 112-135, https://onlinelibrary.wiley.com/doi/10.1002/pam.22037 (accessed on 4 August 2026).</w:t>
       </w:r>
     </w:p>
     <w:p>
@@ -11819,7 +11835,7 @@
           <w:sz w:val="21"/>
           <w:szCs w:val="21"/>
         </w:rPr>
-        <w:t xml:space="preserve">European Commission (2023), </w:t>
+        <w:t xml:space="preserve">Fitzpatrick, M. D. (2015), "How much are public school teachers willing to pay for their retirement benefits?", </w:t>
       </w:r>
       <w:r>
         <w:rPr>
@@ -11828,14 +11844,14 @@
           <w:sz w:val="21"/>
           <w:szCs w:val="21"/>
         </w:rPr>
-        <w:t xml:space="preserve">Education and Training Monitor 2023: Comparative Report</w:t>
-      </w:r>
-      <w:r>
-        <w:rPr>
-          <w:sz w:val="21"/>
-          <w:szCs w:val="21"/>
-        </w:rPr>
-        <w:t xml:space="preserve">, Publications Office of the European Union, Luxembourg, https://op.europa.eu/webpub/eac/education-and-training-monitor-2023/ (accessed on 4 August 2026).</w:t>
+        <w:t xml:space="preserve">American Economic Journal: Economic Policy</w:t>
+      </w:r>
+      <w:r>
+        <w:rPr>
+          <w:sz w:val="21"/>
+          <w:szCs w:val="21"/>
+        </w:rPr>
+        <w:t xml:space="preserve">, Vol. 7/4, https://www.aeaweb.org/articles?id=10.1257/pol.20140087 (accessed on 4 August 2026).</w:t>
       </w:r>
     </w:p>
     <w:p>
@@ -11849,7 +11865,7 @@
           <w:sz w:val="21"/>
           <w:szCs w:val="21"/>
         </w:rPr>
-        <w:t xml:space="preserve">Feng, L. and T. Sass (2018), "The impact of incentives to recruit and retain teachers in 'hard-to-staff' subjects", </w:t>
+        <w:t xml:space="preserve">Fleck, L., M. Somers, T. Stolp, W. Groot, F. van Merode and R. de Vries (2025), "The Effectiveness of Interventions to Increase Employment in Education and Healthcare: A Systematic Literature Review", </w:t>
       </w:r>
       <w:r>
         <w:rPr>
@@ -11858,14 +11874,14 @@
           <w:sz w:val="21"/>
           <w:szCs w:val="21"/>
         </w:rPr>
-        <w:t xml:space="preserve">Journal of Policy Analysis and Management</w:t>
-      </w:r>
-      <w:r>
-        <w:rPr>
-          <w:sz w:val="21"/>
-          <w:szCs w:val="21"/>
-        </w:rPr>
-        <w:t xml:space="preserve">, Vol. 37/1, pp. 112-135, https://onlinelibrary.wiley.com/doi/10.1002/pam.22037 (accessed on 4 August 2026).</w:t>
+        <w:t xml:space="preserve">De Economist</w:t>
+      </w:r>
+      <w:r>
+        <w:rPr>
+          <w:sz w:val="21"/>
+          <w:szCs w:val="21"/>
+        </w:rPr>
+        <w:t xml:space="preserve">, Vol. 173, pp. 1-45, published online 16 December 2024, https://doi.org/10.1007/s10645-024-09440-8 (accessed on 5 August 2026).</w:t>
       </w:r>
     </w:p>
     <w:p>
@@ -11879,7 +11895,7 @@
           <w:sz w:val="21"/>
           <w:szCs w:val="21"/>
         </w:rPr>
-        <w:t xml:space="preserve">Fitzpatrick, M. D. (2015), "How much are public school teachers willing to pay for their retirement benefits?", </w:t>
+        <w:t xml:space="preserve">Fried, L. P. et al. (2004), "A social model for health promotion for an aging population: Initial evidence on the Experience Corps model", </w:t>
       </w:r>
       <w:r>
         <w:rPr>
@@ -11888,14 +11904,14 @@
           <w:sz w:val="21"/>
           <w:szCs w:val="21"/>
         </w:rPr>
-        <w:t xml:space="preserve">American Economic Journal: Economic Policy</w:t>
-      </w:r>
-      <w:r>
-        <w:rPr>
-          <w:sz w:val="21"/>
-          <w:szCs w:val="21"/>
-        </w:rPr>
-        <w:t xml:space="preserve">, Vol. 7/4, https://www.aeaweb.org/articles?id=10.1257/pol.20140087 (accessed on 4 August 2026).</w:t>
+        <w:t xml:space="preserve">Journal of Urban Health</w:t>
+      </w:r>
+      <w:r>
+        <w:rPr>
+          <w:sz w:val="21"/>
+          <w:szCs w:val="21"/>
+        </w:rPr>
+        <w:t xml:space="preserve">, Vol. 81/1, pp. 64-78, https://doi.org/10.1093/jurban/jth094 (accessed on 4 August 2026).</w:t>
       </w:r>
     </w:p>
     <w:p>
@@ -11909,7 +11925,7 @@
           <w:sz w:val="21"/>
           <w:szCs w:val="21"/>
         </w:rPr>
-        <w:t xml:space="preserve">Fleck, L., M. Somers, T. Stolp, W. Groot, F. van Merode and R. de Vries (2025), "The Effectiveness of Interventions to Increase Employment in Education and Healthcare: A Systematic Literature Review", </w:t>
+        <w:t xml:space="preserve">Fuchs, L. S., D. L. Compton, D. Fuchs, K. Paulsen, J. D. Bryant and C. L. Hamlett (2005), "The prevention, identification, and cognitive determinants of math difficulty", </w:t>
       </w:r>
       <w:r>
         <w:rPr>
@@ -11918,14 +11934,14 @@
           <w:sz w:val="21"/>
           <w:szCs w:val="21"/>
         </w:rPr>
-        <w:t xml:space="preserve">De Economist</w:t>
-      </w:r>
-      <w:r>
-        <w:rPr>
-          <w:sz w:val="21"/>
-          <w:szCs w:val="21"/>
-        </w:rPr>
-        <w:t xml:space="preserve">, Vol. 173, pp. 1-45, published online 16 December 2024, https://doi.org/10.1007/s10645-024-09440-8 (accessed on 5 August 2026).</w:t>
+        <w:t xml:space="preserve">Journal of Educational Psychology</w:t>
+      </w:r>
+      <w:r>
+        <w:rPr>
+          <w:sz w:val="21"/>
+          <w:szCs w:val="21"/>
+        </w:rPr>
+        <w:t xml:space="preserve">, Vol. 97/3, pp. 493-513, https://doi.org/10.1037/0022-0663.97.3.493.</w:t>
       </w:r>
     </w:p>
     <w:p>
@@ -11939,7 +11955,7 @@
           <w:sz w:val="21"/>
           <w:szCs w:val="21"/>
         </w:rPr>
-        <w:t xml:space="preserve">Fried, L. P. et al. (2004), "A social model for health promotion for an aging population: Initial evidence on the Experience Corps model", </w:t>
+        <w:t xml:space="preserve">Georgia Department of Audits and Accounts, Performance Audit Division (2025), </w:t>
       </w:r>
       <w:r>
         <w:rPr>
@@ -11948,14 +11964,14 @@
           <w:sz w:val="21"/>
           <w:szCs w:val="21"/>
         </w:rPr>
-        <w:t xml:space="preserve">Journal of Urban Health</w:t>
-      </w:r>
-      <w:r>
-        <w:rPr>
-          <w:sz w:val="21"/>
-          <w:szCs w:val="21"/>
-        </w:rPr>
-        <w:t xml:space="preserve">, Vol. 81/1, pp. 64-78, https://doi.org/10.1093/jurban/jth094 (accessed on 4 August 2026).</w:t>
+        <w:t xml:space="preserve">Retired Teachers Return to Work: Requested Information on the Full-Time Employment of Retired Teachers</w:t>
+      </w:r>
+      <w:r>
+        <w:rPr>
+          <w:sz w:val="21"/>
+          <w:szCs w:val="21"/>
+        </w:rPr>
+        <w:t xml:space="preserve">, Performance Audit Report No. 24-20, Atlanta, April 2025, https://www.audits.ga.gov/ReportSearch/download/32615 (accessed on 4 August 2026).</w:t>
       </w:r>
     </w:p>
     <w:p>
@@ -11969,7 +11985,7 @@
           <w:sz w:val="21"/>
           <w:szCs w:val="21"/>
         </w:rPr>
-        <w:t xml:space="preserve">Fuchs, L. S., D. L. Compton, D. Fuchs, K. Paulsen, J. D. Bryant and C. L. Hamlett (2005), "The prevention, identification, and cognitive determinants of math difficulty", </w:t>
+        <w:t xml:space="preserve">Gersten, R., E. Rolfhus, B. Clarke, L. E. Decker, C. Wilkins and J. Dimino (2015), "Intervention for first graders with limited number knowledge: Large-scale replication of a randomized controlled trial", </w:t>
       </w:r>
       <w:r>
         <w:rPr>
@@ -11978,14 +11994,14 @@
           <w:sz w:val="21"/>
           <w:szCs w:val="21"/>
         </w:rPr>
-        <w:t xml:space="preserve">Journal of Educational Psychology</w:t>
-      </w:r>
-      <w:r>
-        <w:rPr>
-          <w:sz w:val="21"/>
-          <w:szCs w:val="21"/>
-        </w:rPr>
-        <w:t xml:space="preserve">, Vol. 97/3, pp. 493-513, https://doi.org/10.1037/0022-0663.97.3.493.</w:t>
+        <w:t xml:space="preserve">American Educational Research Journal</w:t>
+      </w:r>
+      <w:r>
+        <w:rPr>
+          <w:sz w:val="21"/>
+          <w:szCs w:val="21"/>
+        </w:rPr>
+        <w:t xml:space="preserve">, Vol. 52/3, pp. 516-546, https://doi.org/10.3102/0002831214565787 (accessed on 4 August 2026).</w:t>
       </w:r>
     </w:p>
     <w:p>
@@ -11999,7 +12015,7 @@
           <w:sz w:val="21"/>
           <w:szCs w:val="21"/>
         </w:rPr>
-        <w:t xml:space="preserve">Georgia Department of Audits and Accounts, Performance Audit Division (2025), </w:t>
+        <w:t xml:space="preserve">Glazerman, S., E. Isenberg, S. Dolfin, M. Bleeker, A. Johnson, M. Grider and M. Jacobus (2010), </w:t>
       </w:r>
       <w:r>
         <w:rPr>
@@ -12008,14 +12024,14 @@
           <w:sz w:val="21"/>
           <w:szCs w:val="21"/>
         </w:rPr>
-        <w:t xml:space="preserve">Retired Teachers Return to Work: Requested Information on the Full-Time Employment of Retired Teachers</w:t>
-      </w:r>
-      <w:r>
-        <w:rPr>
-          <w:sz w:val="21"/>
-          <w:szCs w:val="21"/>
-        </w:rPr>
-        <w:t xml:space="preserve">, Performance Audit Report No. 24-20, Atlanta, April 2025, https://www.audits.ga.gov/ReportSearch/download/32615 (accessed on 4 August 2026).</w:t>
+        <w:t xml:space="preserve">Impacts of Comprehensive Teacher Induction: Final Results from a Randomized Controlled Study</w:t>
+      </w:r>
+      <w:r>
+        <w:rPr>
+          <w:sz w:val="21"/>
+          <w:szCs w:val="21"/>
+        </w:rPr>
+        <w:t xml:space="preserve"> (NCEE 2010-4028), National Center for Education Evaluation and Regional Assistance, Institute of Education Sciences, U.S. Department of Education, Washington, DC, https://ies.ed.gov/ncee/pubs/20104027/pdf/20104028.pdf.</w:t>
       </w:r>
     </w:p>
     <w:p>
@@ -12029,23 +12045,7 @@
           <w:sz w:val="21"/>
           <w:szCs w:val="21"/>
         </w:rPr>
-        <w:t xml:space="preserve">Gersten, R., E. Rolfhus, B. Clarke, L. E. Decker, C. Wilkins and J. Dimino (2015), "Intervention for first graders with limited number knowledge: Large-scale replication of a randomized controlled trial", </w:t>
-      </w:r>
-      <w:r>
-        <w:rPr>
-          <w:i/>
-          <w:iCs/>
-          <w:sz w:val="21"/>
-          <w:szCs w:val="21"/>
-        </w:rPr>
-        <w:t xml:space="preserve">American Educational Research Journal</w:t>
-      </w:r>
-      <w:r>
-        <w:rPr>
-          <w:sz w:val="21"/>
-          <w:szCs w:val="21"/>
-        </w:rPr>
-        <w:t xml:space="preserve">, Vol. 52/3, pp. 516-546, https://doi.org/10.3102/0002831214565787 (accessed on 4 August 2026).</w:t>
+        <w:t xml:space="preserve">Global News (2022), "Ontario allowing retired teachers to work more days in bid to address staffing shortages", 10 January 2022, https://globalnews.ca/news/8500734/ontario-retired-teachers-allowed-work-more-days-covid/ (accessed on 4 August 2026).</w:t>
       </w:r>
     </w:p>
     <w:p>
@@ -12059,7 +12059,7 @@
           <w:sz w:val="21"/>
           <w:szCs w:val="21"/>
         </w:rPr>
-        <w:t xml:space="preserve">Glazerman, S., E. Isenberg, S. Dolfin, M. Bleeker, A. Johnson, M. Grider and M. Jacobus (2010), </w:t>
+        <w:t xml:space="preserve">Grissom, J. A. and M. Reininger (2012), "Who Comes Back? A Longitudinal Analysis of the Reentry Behavior of Exiting Teachers", </w:t>
       </w:r>
       <w:r>
         <w:rPr>
@@ -12068,14 +12068,14 @@
           <w:sz w:val="21"/>
           <w:szCs w:val="21"/>
         </w:rPr>
-        <w:t xml:space="preserve">Impacts of Comprehensive Teacher Induction: Final Results from a Randomized Controlled Study</w:t>
-      </w:r>
-      <w:r>
-        <w:rPr>
-          <w:sz w:val="21"/>
-          <w:szCs w:val="21"/>
-        </w:rPr>
-        <w:t xml:space="preserve"> (NCEE 2010-4028), National Center for Education Evaluation and Regional Assistance, Institute of Education Sciences, U.S. Department of Education, Washington, DC, https://ies.ed.gov/ncee/pubs/20104027/pdf/20104028.pdf.</w:t>
+        <w:t xml:space="preserve">Education Finance and Policy</w:t>
+      </w:r>
+      <w:r>
+        <w:rPr>
+          <w:sz w:val="21"/>
+          <w:szCs w:val="21"/>
+        </w:rPr>
+        <w:t xml:space="preserve">, Vol. 7/4, pp. 425-454, https://direct.mit.edu/edfp/article-abstract/7/4/425/10162.</w:t>
       </w:r>
     </w:p>
     <w:p>
@@ -12089,7 +12089,23 @@
           <w:sz w:val="21"/>
           <w:szCs w:val="21"/>
         </w:rPr>
-        <w:t xml:space="preserve">Global News (2022), "Ontario allowing retired teachers to work more days in bid to address staffing shortages", 10 January 2022, https://globalnews.ca/news/8500734/ontario-retired-teachers-allowed-work-more-days-covid/ (accessed on 4 August 2026).</w:t>
+        <w:t xml:space="preserve">Hammer, K. and C. Alphonso (2010), "Ontario to monitor retired teachers' costly supply work", </w:t>
+      </w:r>
+      <w:r>
+        <w:rPr>
+          <w:i/>
+          <w:iCs/>
+          <w:sz w:val="21"/>
+          <w:szCs w:val="21"/>
+        </w:rPr>
+        <w:t xml:space="preserve">The Globe and Mail</w:t>
+      </w:r>
+      <w:r>
+        <w:rPr>
+          <w:sz w:val="21"/>
+          <w:szCs w:val="21"/>
+        </w:rPr>
+        <w:t xml:space="preserve">, 10 May 2010, https://www.theglobeandmail.com/news/national/ontario-to-monitor-retired-teachers-costly-supply-work/article1211108/ (accessed on 4 August 2026).</w:t>
       </w:r>
     </w:p>
     <w:p>
@@ -12103,7 +12119,7 @@
           <w:sz w:val="21"/>
           <w:szCs w:val="21"/>
         </w:rPr>
-        <w:t xml:space="preserve">Grissom, J. A. and M. Reininger (2012), "Who Comes Back? A Longitudinal Analysis of the Reentry Behavior of Exiting Teachers", </w:t>
+        <w:t xml:space="preserve">Harris, D. N. and S. J. Adams (2007), "Understanding the level and causes of teacher turnover: A comparison with other professions", </w:t>
       </w:r>
       <w:r>
         <w:rPr>
@@ -12112,14 +12128,14 @@
           <w:sz w:val="21"/>
           <w:szCs w:val="21"/>
         </w:rPr>
-        <w:t xml:space="preserve">Education Finance and Policy</w:t>
-      </w:r>
-      <w:r>
-        <w:rPr>
-          <w:sz w:val="21"/>
-          <w:szCs w:val="21"/>
-        </w:rPr>
-        <w:t xml:space="preserve">, Vol. 7/4, pp. 425-454, https://direct.mit.edu/edfp/article-abstract/7/4/425/10162.</w:t>
+        <w:t xml:space="preserve">Economics of Education Review</w:t>
+      </w:r>
+      <w:r>
+        <w:rPr>
+          <w:sz w:val="21"/>
+          <w:szCs w:val="21"/>
+        </w:rPr>
+        <w:t xml:space="preserve">, Vol. 26/3, pp. 325-337, https://www.sciencedirect.com/science/article/abs/pii/S027277570600029X.</w:t>
       </w:r>
     </w:p>
     <w:p>
@@ -12133,7 +12149,7 @@
           <w:sz w:val="21"/>
           <w:szCs w:val="21"/>
         </w:rPr>
-        <w:t xml:space="preserve">Hammer, K. and C. Alphonso (2010), "Ontario to monitor retired teachers' costly supply work", </w:t>
+        <w:t xml:space="preserve">Hessisches Ministerium für Kultus, Bildung und Chancen (2024), </w:t>
       </w:r>
       <w:r>
         <w:rPr>
@@ -12142,14 +12158,14 @@
           <w:sz w:val="21"/>
           <w:szCs w:val="21"/>
         </w:rPr>
-        <w:t xml:space="preserve">The Globe and Mail</w:t>
-      </w:r>
-      <w:r>
-        <w:rPr>
-          <w:sz w:val="21"/>
-          <w:szCs w:val="21"/>
-        </w:rPr>
-        <w:t xml:space="preserve">, 10 May 2010, https://www.theglobeandmail.com/news/national/ontario-to-monitor-retired-teachers-costly-supply-work/article1211108/ (accessed on 4 August 2026).</w:t>
+        <w:t xml:space="preserve">Verlässlichkeit und Qualität – Hessen sichert die bestmögliche Unterrichtsversorgung</w:t>
+      </w:r>
+      <w:r>
+        <w:rPr>
+          <w:sz w:val="21"/>
+          <w:szCs w:val="21"/>
+        </w:rPr>
+        <w:t xml:space="preserve">, Wiesbaden, https://kultus.hessen.de/sites/kultus.hessen.de/files/2024-03/handlungskonzept.pdf (accessed on 5 August 2026).</w:t>
       </w:r>
     </w:p>
     <w:p>
@@ -12163,7 +12179,7 @@
           <w:sz w:val="21"/>
           <w:szCs w:val="21"/>
         </w:rPr>
-        <w:t xml:space="preserve">Harris, D. N. and S. J. Adams (2007), "Understanding the level and causes of teacher turnover: A comparison with other professions", </w:t>
+        <w:t xml:space="preserve">Jackson, C. K. and E. Bruegmann (2009), "Teaching students and teaching each other: The importance of peer learning for teachers", </w:t>
       </w:r>
       <w:r>
         <w:rPr>
@@ -12172,14 +12188,14 @@
           <w:sz w:val="21"/>
           <w:szCs w:val="21"/>
         </w:rPr>
-        <w:t xml:space="preserve">Economics of Education Review</w:t>
-      </w:r>
-      <w:r>
-        <w:rPr>
-          <w:sz w:val="21"/>
-          <w:szCs w:val="21"/>
-        </w:rPr>
-        <w:t xml:space="preserve">, Vol. 26/3, pp. 325-337, https://www.sciencedirect.com/science/article/abs/pii/S027277570600029X.</w:t>
+        <w:t xml:space="preserve">American Economic Journal: Applied Economics</w:t>
+      </w:r>
+      <w:r>
+        <w:rPr>
+          <w:sz w:val="21"/>
+          <w:szCs w:val="21"/>
+        </w:rPr>
+        <w:t xml:space="preserve">, Vol. 1/4, pp. 85-108, https://www.aeaweb.org/articles?id=10.1257/app.1.4.85.</w:t>
       </w:r>
     </w:p>
     <w:p>
@@ -12193,7 +12209,7 @@
           <w:sz w:val="21"/>
           <w:szCs w:val="21"/>
         </w:rPr>
-        <w:t xml:space="preserve">Hessisches Ministerium für Kultus, Bildung und Chancen (2024), </w:t>
+        <w:t xml:space="preserve">Jarrold-Grapes, R. and P. P. Mahler (2024), "Retirees return to work: How a North Carolina policy helped staff high-need schools", </w:t>
       </w:r>
       <w:r>
         <w:rPr>
@@ -12202,14 +12218,14 @@
           <w:sz w:val="21"/>
           <w:szCs w:val="21"/>
         </w:rPr>
-        <w:t xml:space="preserve">Verlässlichkeit und Qualität – Hessen sichert die bestmögliche Unterrichtsversorgung</w:t>
-      </w:r>
-      <w:r>
-        <w:rPr>
-          <w:sz w:val="21"/>
-          <w:szCs w:val="21"/>
-        </w:rPr>
-        <w:t xml:space="preserve">, Wiesbaden, https://kultus.hessen.de/sites/kultus.hessen.de/files/2024-03/handlungskonzept.pdf (accessed on 5 August 2026).</w:t>
+        <w:t xml:space="preserve">Education Policy Analysis Archives</w:t>
+      </w:r>
+      <w:r>
+        <w:rPr>
+          <w:sz w:val="21"/>
+          <w:szCs w:val="21"/>
+        </w:rPr>
+        <w:t xml:space="preserve">, Vol. 32, No. 4, https://doi.org/10.14507/epaa.32.8241 (accessed on 4 August 2026).</w:t>
       </w:r>
     </w:p>
     <w:p>
@@ -12223,7 +12239,7 @@
           <w:sz w:val="21"/>
           <w:szCs w:val="21"/>
         </w:rPr>
-        <w:t xml:space="preserve">Jackson, C. K. and E. Bruegmann (2009), "Teaching students and teaching each other: The importance of peer learning for teachers", </w:t>
+        <w:t xml:space="preserve">Lindsay, J., N. Gnedko-Berry and C. Wan (2021), </w:t>
       </w:r>
       <w:r>
         <w:rPr>
@@ -12232,14 +12248,14 @@
           <w:sz w:val="21"/>
           <w:szCs w:val="21"/>
         </w:rPr>
-        <w:t xml:space="preserve">American Economic Journal: Applied Economics</w:t>
-      </w:r>
-      <w:r>
-        <w:rPr>
-          <w:sz w:val="21"/>
-          <w:szCs w:val="21"/>
-        </w:rPr>
-        <w:t xml:space="preserve">, Vol. 1/4, pp. 85-108, https://www.aeaweb.org/articles?id=10.1257/app.1.4.85.</w:t>
+        <w:t xml:space="preserve">Michigan Teachers Who Are Not Teaching: Who Are They, and What Would Motivate Them to Teach?</w:t>
+      </w:r>
+      <w:r>
+        <w:rPr>
+          <w:sz w:val="21"/>
+          <w:szCs w:val="21"/>
+        </w:rPr>
+        <w:t xml:space="preserve"> (REL 2021-076), Regional Educational Laboratory Midwest, Institute of Education Sciences, U.S. Department of Education, Washington, DC, https://files.eric.ed.gov/fulltext/ED611790.pdf (Study Snapshot: https://eric.ed.gov/?id=ED611792) (accessed on 5 August 2026).</w:t>
       </w:r>
     </w:p>
     <w:p>
@@ -12253,7 +12269,7 @@
           <w:sz w:val="21"/>
           <w:szCs w:val="21"/>
         </w:rPr>
-        <w:t xml:space="preserve">Jarrold-Grapes, R. and P. P. Mahler (2024), "Retirees return to work: How a North Carolina policy helped staff high-need schools", </w:t>
+        <w:t xml:space="preserve">Lizalde Gil, M. and M. P. A. Cortés Pascual (2019), "10 mirrors: El acompañamiento y la orientación formativa de los estudiantes de los grados en magisterio desde la experiencia profesional", in P. Allueva Torres (coord.), </w:t>
       </w:r>
       <w:r>
         <w:rPr>
@@ -12262,14 +12278,14 @@
           <w:sz w:val="21"/>
           <w:szCs w:val="21"/>
         </w:rPr>
-        <w:t xml:space="preserve">Education Policy Analysis Archives</w:t>
-      </w:r>
-      <w:r>
-        <w:rPr>
-          <w:sz w:val="21"/>
-          <w:szCs w:val="21"/>
-        </w:rPr>
-        <w:t xml:space="preserve">, Vol. 32, No. 4, https://doi.org/10.14507/epaa.32.8241 (accessed on 4 August 2026).</w:t>
+        <w:t xml:space="preserve">Orientación y calidad educativa universitarias</w:t>
+      </w:r>
+      <w:r>
+        <w:rPr>
+          <w:sz w:val="21"/>
+          <w:szCs w:val="21"/>
+        </w:rPr>
+        <w:t xml:space="preserve">, Servicio de Publicaciones, Universidad de Zaragoza, Zaragoza, pp. 373-384, https://dialnet.unirioja.es/servlet/articulo?codigo=8153125.</w:t>
       </w:r>
     </w:p>
     <w:p>
@@ -12283,23 +12299,7 @@
           <w:sz w:val="21"/>
           <w:szCs w:val="21"/>
         </w:rPr>
-        <w:t xml:space="preserve">Lindsay, J., N. Gnedko-Berry and C. Wan (2021), </w:t>
-      </w:r>
-      <w:r>
-        <w:rPr>
-          <w:i/>
-          <w:iCs/>
-          <w:sz w:val="21"/>
-          <w:szCs w:val="21"/>
-        </w:rPr>
-        <w:t xml:space="preserve">Michigan Teachers Who Are Not Teaching: Who Are They, and What Would Motivate Them to Teach?</w:t>
-      </w:r>
-      <w:r>
-        <w:rPr>
-          <w:sz w:val="21"/>
-          <w:szCs w:val="21"/>
-        </w:rPr>
-        <w:t xml:space="preserve"> (REL 2021-076), Regional Educational Laboratory Midwest, Institute of Education Sciences, U.S. Department of Education, Washington, DC, https://files.eric.ed.gov/fulltext/ED611790.pdf (Study Snapshot: https://eric.ed.gov/?id=ED611792) (accessed on 5 August 2026).</w:t>
+        <w:t xml:space="preserve">Michigan Office of Retirement Services (2022), "Archive: PA 184 of 2022 – Change to working after retirement rules", https://www.michigan.gov/psru/administration-and-compliance/archive-legislative-updates/pa-184-of-2022---change-to-working-after-retirement-rules (accessed on 4 August 2026).</w:t>
       </w:r>
     </w:p>
     <w:p>
@@ -12313,23 +12313,7 @@
           <w:sz w:val="21"/>
           <w:szCs w:val="21"/>
         </w:rPr>
-        <w:t xml:space="preserve">Lizalde Gil, M. and M. P. A. Cortés Pascual (2019), "10 mirrors: El acompañamiento y la orientación formativa de los estudiantes de los grados en magisterio desde la experiencia profesional", in P. Allueva Torres (coord.), </w:t>
-      </w:r>
-      <w:r>
-        <w:rPr>
-          <w:i/>
-          <w:iCs/>
-          <w:sz w:val="21"/>
-          <w:szCs w:val="21"/>
-        </w:rPr>
-        <w:t xml:space="preserve">Orientación y calidad educativa universitarias</w:t>
-      </w:r>
-      <w:r>
-        <w:rPr>
-          <w:sz w:val="21"/>
-          <w:szCs w:val="21"/>
-        </w:rPr>
-        <w:t xml:space="preserve">, Servicio de Publicaciones, Universidad de Zaragoza, Zaragoza, pp. 373-384, https://dialnet.unirioja.es/servlet/articulo?codigo=8153125.</w:t>
+        <w:t xml:space="preserve">Michigan Office of Retirement Services (2023), "Public Act 147 of 2023 working after retirement FAQ", https://www.michigan.gov/psru/reporting-resources/frequently-asked-questions/public-act-147-of-2023-working-after-retirement-faq (accessed on 4 August 2026).</w:t>
       </w:r>
     </w:p>
     <w:p>
@@ -12343,7 +12327,23 @@
           <w:sz w:val="21"/>
           <w:szCs w:val="21"/>
         </w:rPr>
-        <w:t xml:space="preserve">Michigan Office of Retirement Services (2022), "Archive: PA 184 of 2022 – Change to working after retirement rules", https://www.michigan.gov/psru/administration-and-compliance/archive-legislative-updates/pa-184-of-2022---change-to-working-after-retirement-rules (accessed on 4 August 2026).</w:t>
+        <w:t xml:space="preserve">Ministerie van OCW (2017), "Regeling tegemoetkoming herintreders primair onderwijs", </w:t>
+      </w:r>
+      <w:r>
+        <w:rPr>
+          <w:i/>
+          <w:iCs/>
+          <w:sz w:val="21"/>
+          <w:szCs w:val="21"/>
+        </w:rPr>
+        <w:t xml:space="preserve">Staatscourant</w:t>
+      </w:r>
+      <w:r>
+        <w:rPr>
+          <w:sz w:val="21"/>
+          <w:szCs w:val="21"/>
+        </w:rPr>
+        <w:t xml:space="preserve"> 2017, No. 62002, https://zoek.officielebekendmakingen.nl/stcrt-2017-62002.html (accessed on 5 August 2026).</w:t>
       </w:r>
     </w:p>
     <w:p>
@@ -12357,7 +12357,23 @@
           <w:sz w:val="21"/>
           <w:szCs w:val="21"/>
         </w:rPr>
-        <w:t xml:space="preserve">Michigan Office of Retirement Services (2023), "Public Act 147 of 2023 working after retirement FAQ", https://www.michigan.gov/psru/reporting-resources/frequently-asked-questions/public-act-147-of-2023-working-after-retirement-faq (accessed on 4 August 2026).</w:t>
+        <w:t xml:space="preserve">Ministerie van OCW (2019a), "Regeling tot wijziging van de Regeling tegemoetkoming herintreders primair onderwijs", </w:t>
+      </w:r>
+      <w:r>
+        <w:rPr>
+          <w:i/>
+          <w:iCs/>
+          <w:sz w:val="21"/>
+          <w:szCs w:val="21"/>
+        </w:rPr>
+        <w:t xml:space="preserve">Staatscourant</w:t>
+      </w:r>
+      <w:r>
+        <w:rPr>
+          <w:sz w:val="21"/>
+          <w:szCs w:val="21"/>
+        </w:rPr>
+        <w:t xml:space="preserve"> 2019, No. 28510, https://zoek.officielebekendmakingen.nl/stcrt-2019-28510.html (accessed on 5 August 2026).</w:t>
       </w:r>
     </w:p>
     <w:p>
@@ -12371,23 +12387,7 @@
           <w:sz w:val="21"/>
           <w:szCs w:val="21"/>
         </w:rPr>
-        <w:t xml:space="preserve">Ministerie van OCW (2017), "Regeling tegemoetkoming herintreders primair onderwijs", </w:t>
-      </w:r>
-      <w:r>
-        <w:rPr>
-          <w:i/>
-          <w:iCs/>
-          <w:sz w:val="21"/>
-          <w:szCs w:val="21"/>
-        </w:rPr>
-        <w:t xml:space="preserve">Staatscourant</w:t>
-      </w:r>
-      <w:r>
-        <w:rPr>
-          <w:sz w:val="21"/>
-          <w:szCs w:val="21"/>
-        </w:rPr>
-        <w:t xml:space="preserve"> 2017, No. 62002, https://zoek.officielebekendmakingen.nl/stcrt-2017-62002.html (accessed on 5 August 2026).</w:t>
+        <w:t xml:space="preserve">Ministerie van OCW (2019b), "Subsidie voor herintreders", Nieuwsbrief, 3 July 2019, https://www.nieuwsbrievenminocw.nl/actueel/nieuws/2019/07/03/subsidie-voor-herintreders (accessed on 5 August 2026).</w:t>
       </w:r>
     </w:p>
     <w:p>
@@ -12401,23 +12401,7 @@
           <w:sz w:val="21"/>
           <w:szCs w:val="21"/>
         </w:rPr>
-        <w:t xml:space="preserve">Ministerie van OCW (2019a), "Regeling tot wijziging van de Regeling tegemoetkoming herintreders primair onderwijs", </w:t>
-      </w:r>
-      <w:r>
-        <w:rPr>
-          <w:i/>
-          <w:iCs/>
-          <w:sz w:val="21"/>
-          <w:szCs w:val="21"/>
-        </w:rPr>
-        <w:t xml:space="preserve">Staatscourant</w:t>
-      </w:r>
-      <w:r>
-        <w:rPr>
-          <w:sz w:val="21"/>
-          <w:szCs w:val="21"/>
-        </w:rPr>
-        <w:t xml:space="preserve"> 2019, No. 28510, https://zoek.officielebekendmakingen.nl/stcrt-2019-28510.html (accessed on 5 August 2026).</w:t>
+        <w:t xml:space="preserve">MOE (2025), "MOE to launch 2025 National Silver Age Teacher Action Plan", Ministry of Education of the People's Republic of China, 11 October 2025, http://en.moe.gov.cn/news/press_releases/202510/t20251011_1416386.html.</w:t>
       </w:r>
     </w:p>
     <w:p>
@@ -12431,7 +12415,7 @@
           <w:sz w:val="21"/>
           <w:szCs w:val="21"/>
         </w:rPr>
-        <w:t xml:space="preserve">Ministerie van OCW (2019b), "Subsidie voor herintreders", Nieuwsbrief, 3 July 2019, https://www.nieuwsbrievenminocw.nl/actueel/nieuws/2019/07/03/subsidie-voor-herintreders (accessed on 5 August 2026).</w:t>
+        <w:t xml:space="preserve">MOE and MOF (2018), 教育部 财政部关于印发《银龄讲学计划实施方案》的通知 [Notice on Issuing the Implementation Scheme of the Silver Age Lecturing Plan], 教师〔2018〕7号, Ministry of Education and Ministry of Finance, Beijing, July 2018, http://www.moe.gov.cn/srcsite/A10/s7151/201807/t20180719_343448.html (accessed on 4 August 2026).</w:t>
       </w:r>
     </w:p>
     <w:p>
@@ -12445,7 +12429,7 @@
           <w:sz w:val="21"/>
           <w:szCs w:val="21"/>
         </w:rPr>
-        <w:t xml:space="preserve">MOE (2025), "MOE to launch 2025 National Silver Age Teacher Action Plan", Ministry of Education of the People's Republic of China, 11 October 2025, http://en.moe.gov.cn/news/press_releases/202510/t20251011_1416386.html.</w:t>
+        <w:t xml:space="preserve">MOE et al. (2023), 教育部等十部门关于印发《国家银龄教师行动计划》的通知 [Notice by the Ministry of Education and Nine Other Departments on Issuing the National Silver Age Teachers Action Plan], 教师〔2023〕6号, 14 July 2023, https://www.gov.cn/zhengce/zhengceku/202308/content_6900984.htm (accessed on 4 August 2026).</w:t>
       </w:r>
     </w:p>
     <w:p>
@@ -12459,7 +12443,23 @@
           <w:sz w:val="21"/>
           <w:szCs w:val="21"/>
         </w:rPr>
-        <w:t xml:space="preserve">MOE and MOF (2018), 教育部 财政部关于印发《银龄讲学计划实施方案》的通知 [Notice on Issuing the Implementation Scheme of the Silver Age Lecturing Plan], 教师〔2018〕7号, Ministry of Education and Ministry of Finance, Beijing, July 2018, http://www.moe.gov.cn/srcsite/A10/s7151/201807/t20180719_343448.html (accessed on 4 August 2026).</w:t>
+        <w:t xml:space="preserve">Morrow-Howell, N., M. Jonson-Reid, S. McCrary, Y. Lee and E. Spitznagel (2009), </w:t>
+      </w:r>
+      <w:r>
+        <w:rPr>
+          <w:i/>
+          <w:iCs/>
+          <w:sz w:val="21"/>
+          <w:szCs w:val="21"/>
+        </w:rPr>
+        <w:t xml:space="preserve">Evaluation of Experience Corps: Student Reading Outcomes</w:t>
+      </w:r>
+      <w:r>
+        <w:rPr>
+          <w:sz w:val="21"/>
+          <w:szCs w:val="21"/>
+        </w:rPr>
+        <w:t xml:space="preserve"> (CSD Research Report 09-01), Center for Social Development, Washington University in St. Louis, https://csd.wustl.edu/09-01/ (accessed on 5 August 2026).</w:t>
       </w:r>
     </w:p>
     <w:p>
@@ -12473,7 +12473,23 @@
           <w:sz w:val="21"/>
           <w:szCs w:val="21"/>
         </w:rPr>
-        <w:t xml:space="preserve">MOE et al. (2023), 教育部等十部门关于印发《国家银龄教师行动计划》的通知 [Notice by the Ministry of Education and Nine Other Departments on Issuing the National Silver Age Teachers Action Plan], 教师〔2023〕6号, 14 July 2023, https://www.gov.cn/zhengce/zhengceku/202308/content_6900984.htm (accessed on 4 August 2026).</w:t>
+        <w:t xml:space="preserve">Moyer, A. (2022), "Has 'Who Comes Back' Changed? Teacher Reentry 2000-2019", </w:t>
+      </w:r>
+      <w:r>
+        <w:rPr>
+          <w:i/>
+          <w:iCs/>
+          <w:sz w:val="21"/>
+          <w:szCs w:val="21"/>
+        </w:rPr>
+        <w:t xml:space="preserve">Educational Researcher</w:t>
+      </w:r>
+      <w:r>
+        <w:rPr>
+          <w:sz w:val="21"/>
+          <w:szCs w:val="21"/>
+        </w:rPr>
+        <w:t xml:space="preserve">, Vol. 51/8, pp. 544-546, https://doi.org/10.3102/0013189X221122746.</w:t>
       </w:r>
     </w:p>
     <w:p>
@@ -12487,7 +12503,7 @@
           <w:sz w:val="21"/>
           <w:szCs w:val="21"/>
         </w:rPr>
-        <w:t xml:space="preserve">Morrow-Howell, N., M. Jonson-Reid, S. McCrary, Y. Lee and E. Spitznagel (2009), </w:t>
+        <w:t xml:space="preserve">NCTL (2017), </w:t>
       </w:r>
       <w:r>
         <w:rPr>
@@ -12496,14 +12512,14 @@
           <w:sz w:val="21"/>
           <w:szCs w:val="21"/>
         </w:rPr>
-        <w:t xml:space="preserve">Evaluation of Experience Corps: Student Reading Outcomes</w:t>
-      </w:r>
-      <w:r>
-        <w:rPr>
-          <w:sz w:val="21"/>
-          <w:szCs w:val="21"/>
-        </w:rPr>
-        <w:t xml:space="preserve"> (CSD Research Report 09-01), Center for Social Development, Washington University in St. Louis, https://csd.wustl.edu/09-01/ (accessed on 5 August 2026).</w:t>
+        <w:t xml:space="preserve">Returners Engagement Programme Pilot: Programme and Application Guidance</w:t>
+      </w:r>
+      <w:r>
+        <w:rPr>
+          <w:sz w:val="21"/>
+          <w:szCs w:val="21"/>
+        </w:rPr>
+        <w:t xml:space="preserve">, National College for Teaching and Leadership, January 2017, https://dera.ioe.ac.uk/28252/1/returners-engagement-programme-application-guidance-cohort-2.pdf (accessed on 4 August 2026).</w:t>
       </w:r>
     </w:p>
     <w:p>
@@ -12517,7 +12533,7 @@
           <w:sz w:val="21"/>
           <w:szCs w:val="21"/>
         </w:rPr>
-        <w:t xml:space="preserve">Moyer, A. (2022), "Has 'Who Comes Back' Changed? Teacher Reentry 2000-2019", </w:t>
+        <w:t xml:space="preserve">New Mexico Educational Retirement Board (2023), </w:t>
       </w:r>
       <w:r>
         <w:rPr>
@@ -12526,14 +12542,14 @@
           <w:sz w:val="21"/>
           <w:szCs w:val="21"/>
         </w:rPr>
-        <w:t xml:space="preserve">Educational Researcher</w:t>
-      </w:r>
-      <w:r>
-        <w:rPr>
-          <w:sz w:val="21"/>
-          <w:szCs w:val="21"/>
-        </w:rPr>
-        <w:t xml:space="preserve">, Vol. 51/8, pp. 544-546, https://doi.org/10.3102/0013189X221122746.</w:t>
+        <w:t xml:space="preserve">Discussion on Return to Work</w:t>
+      </w:r>
+      <w:r>
+        <w:rPr>
+          <w:sz w:val="21"/>
+          <w:szCs w:val="21"/>
+        </w:rPr>
+        <w:t xml:space="preserve">, presentation to the Investments &amp; Pensions Oversight Committee, 31 October 2023, https://www.nmlegis.gov/handouts/IPOC%20103123%20Item%204%20E.%20Educational%20Retirement%20Board--Return%20to%20Work.pdf (accessed on 4 August 2026).</w:t>
       </w:r>
     </w:p>
     <w:p>
@@ -12547,23 +12563,7 @@
           <w:sz w:val="21"/>
           <w:szCs w:val="21"/>
         </w:rPr>
-        <w:t xml:space="preserve">NCES (2023), "Eight Percent of Public School Teachers Left Teaching in 2021, a Rate Unchanged Since Last Measured in 2012", press release, 13 December 2023, National Center for Education Statistics, https://ies.ed.gov/learn/press-release/eight-percent-public-school-teachers-left-teaching-2021-rate-unchanged-last-measured-2012; First Look report: </w:t>
-      </w:r>
-      <w:r>
-        <w:rPr>
-          <w:i/>
-          <w:iCs/>
-          <w:sz w:val="21"/>
-          <w:szCs w:val="21"/>
-        </w:rPr>
-        <w:t xml:space="preserve">Teacher Attrition and Mobility: Results From the 2021-22 Teacher Follow-up Survey to the National Teacher and Principal Survey</w:t>
-      </w:r>
-      <w:r>
-        <w:rPr>
-          <w:sz w:val="21"/>
-          <w:szCs w:val="21"/>
-        </w:rPr>
-        <w:t xml:space="preserve"> (NCES 2024-039), https://nces.ed.gov/pubs2024/2024039M.pdf.</w:t>
+        <w:t xml:space="preserve">New Mexico Educational Retirement Board (2025), "Recent Legislation / Legislative Proposals" (SB 133 of 2025), https://www.erb.nm.gov/legislation/recent-legislation-legislative-proposals/ (accessed on 4 August 2026).</w:t>
       </w:r>
     </w:p>
     <w:p>
@@ -12577,23 +12577,7 @@
           <w:sz w:val="21"/>
           <w:szCs w:val="21"/>
         </w:rPr>
-        <w:t xml:space="preserve">NCTL (2017), </w:t>
-      </w:r>
-      <w:r>
-        <w:rPr>
-          <w:i/>
-          <w:iCs/>
-          <w:sz w:val="21"/>
-          <w:szCs w:val="21"/>
-        </w:rPr>
-        <w:t xml:space="preserve">Returners Engagement Programme Pilot: Programme and Application Guidance</w:t>
-      </w:r>
-      <w:r>
-        <w:rPr>
-          <w:sz w:val="21"/>
-          <w:szCs w:val="21"/>
-        </w:rPr>
-        <w:t xml:space="preserve">, National College for Teaching and Leadership, January 2017, https://dera.ioe.ac.uk/28252/1/returners-engagement-programme-application-guidance-cohort-2.pdf (accessed on 4 August 2026).</w:t>
+        <w:t xml:space="preserve">New Mexico Legislature (2022), "HB 73: Educational Retirees Returning to Work", 2022 Regular Session, Chapter 20, https://www.nmlegis.gov/Legislation/Legislation?chamber=H&amp;legType=B&amp;legNo=73&amp;year=22 (accessed on 4 August 2026).</w:t>
       </w:r>
     </w:p>
     <w:p>
@@ -12607,23 +12591,7 @@
           <w:sz w:val="21"/>
           <w:szCs w:val="21"/>
         </w:rPr>
-        <w:t xml:space="preserve">New Mexico Educational Retirement Board (2023), </w:t>
-      </w:r>
-      <w:r>
-        <w:rPr>
-          <w:i/>
-          <w:iCs/>
-          <w:sz w:val="21"/>
-          <w:szCs w:val="21"/>
-        </w:rPr>
-        <w:t xml:space="preserve">Discussion on Return to Work</w:t>
-      </w:r>
-      <w:r>
-        <w:rPr>
-          <w:sz w:val="21"/>
-          <w:szCs w:val="21"/>
-        </w:rPr>
-        <w:t xml:space="preserve">, presentation to the Investments &amp; Pensions Oversight Committee, 31 October 2023, https://www.nmlegis.gov/handouts/IPOC%20103123%20Item%204%20E.%20Educational%20Retirement%20Board--Return%20to%20Work.pdf (accessed on 4 August 2026).</w:t>
+        <w:t xml:space="preserve">New Zealand Government (2025), "New Teacher Bonding Scheme supports schools and teachers", Beehive press release, Hon Erica Stanford, 19 September 2025, https://www.beehive.govt.nz/release/new-teacher-bonding-scheme-supports-schools-and-teachers.</w:t>
       </w:r>
     </w:p>
     <w:p>
@@ -12637,7 +12605,23 @@
           <w:sz w:val="21"/>
           <w:szCs w:val="21"/>
         </w:rPr>
-        <w:t xml:space="preserve">New Mexico Educational Retirement Board (2025), "Recent Legislation / Legislative Proposals" (SB 133 of 2025), https://www.erb.nm.gov/legislation/recent-legislation-legislative-proposals/ (accessed on 4 August 2026).</w:t>
+        <w:t xml:space="preserve">New Zealand Legislation (2020), </w:t>
+      </w:r>
+      <w:r>
+        <w:rPr>
+          <w:i/>
+          <w:iCs/>
+          <w:sz w:val="21"/>
+          <w:szCs w:val="21"/>
+        </w:rPr>
+        <w:t xml:space="preserve">Education and Training Act 2020</w:t>
+      </w:r>
+      <w:r>
+        <w:rPr>
+          <w:sz w:val="21"/>
+          <w:szCs w:val="21"/>
+        </w:rPr>
+        <w:t xml:space="preserve">, No 38, Schedule 3, https://www.legislation.govt.nz/act/public/2020/0038/latest/LMS261224.html (accessed on 4 August 2026).</w:t>
       </w:r>
     </w:p>
     <w:p>
@@ -12651,7 +12635,7 @@
           <w:sz w:val="21"/>
           <w:szCs w:val="21"/>
         </w:rPr>
-        <w:t xml:space="preserve">New Mexico Legislature (2022), "HB 73: Educational Retirees Returning to Work", 2022 Regular Session, Chapter 20, https://www.nmlegis.gov/Legislation/Legislation?chamber=H&amp;legType=B&amp;legNo=73&amp;year=22 (accessed on 4 August 2026).</w:t>
+        <w:t xml:space="preserve">New Zealand Ministry of Education (2026), "Looking for a relief teacher", Education Workforce website, Te Tāhuhu o te Mātauranga, updated 18 June 2026, https://workforce.education.govt.nz/principals-and-schools/local-employment-and-recruitment-support/looking-relief-teacher (accessed on 4 August 2026).</w:t>
       </w:r>
     </w:p>
     <w:p>
@@ -12665,7 +12649,23 @@
           <w:sz w:val="21"/>
           <w:szCs w:val="21"/>
         </w:rPr>
-        <w:t xml:space="preserve">New Zealand Government (2025), "New Teacher Bonding Scheme supports schools and teachers", Beehive press release, Hon Erica Stanford, 19 September 2025, https://www.beehive.govt.nz/release/new-teacher-bonding-scheme-supports-schools-and-teachers.</w:t>
+        <w:t xml:space="preserve">Nguyen, T. D., E. Bettini, C. Redding and A. F. Gilmour (2025), "Comparing Teacher Turnover Intentions to Actual Turnover: Cautions and Lessons for the Field", </w:t>
+      </w:r>
+      <w:r>
+        <w:rPr>
+          <w:i/>
+          <w:iCs/>
+          <w:sz w:val="21"/>
+          <w:szCs w:val="21"/>
+        </w:rPr>
+        <w:t xml:space="preserve">Educational Evaluation and Policy Analysis</w:t>
+      </w:r>
+      <w:r>
+        <w:rPr>
+          <w:sz w:val="21"/>
+          <w:szCs w:val="21"/>
+        </w:rPr>
+        <w:t xml:space="preserve">, https://journals.sagepub.com/doi/abs/10.3102/01623737241249459.</w:t>
       </w:r>
     </w:p>
     <w:p>
@@ -12679,7 +12679,7 @@
           <w:sz w:val="21"/>
           <w:szCs w:val="21"/>
         </w:rPr>
-        <w:t xml:space="preserve">New Zealand Legislation (2020), </w:t>
+        <w:t xml:space="preserve">Nguyen, T. D., L. D. Pham, M. Crouch and M. G. Springer (2020), "The correlates of teacher turnover: An updated and expanded meta-analysis of the literature", </w:t>
       </w:r>
       <w:r>
         <w:rPr>
@@ -12688,14 +12688,14 @@
           <w:sz w:val="21"/>
           <w:szCs w:val="21"/>
         </w:rPr>
-        <w:t xml:space="preserve">Education and Training Act 2020</w:t>
-      </w:r>
-      <w:r>
-        <w:rPr>
-          <w:sz w:val="21"/>
-          <w:szCs w:val="21"/>
-        </w:rPr>
-        <w:t xml:space="preserve">, No 38, Schedule 3, https://www.legislation.govt.nz/act/public/2020/0038/latest/LMS261224.html (accessed on 4 August 2026).</w:t>
+        <w:t xml:space="preserve">Educational Research Review</w:t>
+      </w:r>
+      <w:r>
+        <w:rPr>
+          <w:sz w:val="21"/>
+          <w:szCs w:val="21"/>
+        </w:rPr>
+        <w:t xml:space="preserve">, Vol. 31, 100355, https://www.sciencedirect.com/science/article/abs/pii/S1747938X19305597.</w:t>
       </w:r>
     </w:p>
     <w:p>
@@ -12709,7 +12709,23 @@
           <w:sz w:val="21"/>
           <w:szCs w:val="21"/>
         </w:rPr>
-        <w:t xml:space="preserve">New Zealand Ministry of Education (2026), "Looking for a relief teacher", Education Workforce website, Te Tāhuhu o te Mātauranga, updated 18 June 2026, https://workforce.education.govt.nz/principals-and-schools/local-employment-and-recruitment-support/looking-relief-teacher (accessed on 4 August 2026).</w:t>
+        <w:t xml:space="preserve">Nickow, A., P. Oreopoulos and V. Quan (2024), "The promise of tutoring for preK-12 learning: A systematic review and meta-analysis of the experimental evidence", </w:t>
+      </w:r>
+      <w:r>
+        <w:rPr>
+          <w:i/>
+          <w:iCs/>
+          <w:sz w:val="21"/>
+          <w:szCs w:val="21"/>
+        </w:rPr>
+        <w:t xml:space="preserve">American Educational Research Journal</w:t>
+      </w:r>
+      <w:r>
+        <w:rPr>
+          <w:sz w:val="21"/>
+          <w:szCs w:val="21"/>
+        </w:rPr>
+        <w:t xml:space="preserve">, Vol. 61/1, pp. 74-107, https://journals.sagepub.com/doi/10.3102/00028312231208687.</w:t>
       </w:r>
     </w:p>
     <w:p>
@@ -12723,23 +12739,7 @@
           <w:sz w:val="21"/>
           <w:szCs w:val="21"/>
         </w:rPr>
-        <w:t xml:space="preserve">Nguyen, T. D., E. Bettini, C. Redding and A. F. Gilmour (2025), "Comparing Teacher Turnover Intentions to Actual Turnover: Cautions and Lessons for the Field", </w:t>
-      </w:r>
-      <w:r>
-        <w:rPr>
-          <w:i/>
-          <w:iCs/>
-          <w:sz w:val="21"/>
-          <w:szCs w:val="21"/>
-        </w:rPr>
-        <w:t xml:space="preserve">Educational Evaluation and Policy Analysis</w:t>
-      </w:r>
-      <w:r>
-        <w:rPr>
-          <w:sz w:val="21"/>
-          <w:szCs w:val="21"/>
-        </w:rPr>
-        <w:t xml:space="preserve">, https://journals.sagepub.com/doi/abs/10.3102/01623737241249459.</w:t>
+        <w:t xml:space="preserve">Nippon.com (2026), "3,827 Teacher Positions Unfilled across Japan: 2025 Survey", https://www.nippon.com/en/news/yjj2026030500966/ (accessed on 5 August 2026).</w:t>
       </w:r>
     </w:p>
     <w:p>
@@ -12753,7 +12753,7 @@
           <w:sz w:val="21"/>
           <w:szCs w:val="21"/>
         </w:rPr>
-        <w:t xml:space="preserve">Nguyen, T. D., L. D. Pham, M. Crouch and M. G. Springer (2020), "The correlates of teacher turnover: An updated and expanded meta-analysis of the literature", </w:t>
+        <w:t xml:space="preserve">NSW Department of Education (2024), </w:t>
       </w:r>
       <w:r>
         <w:rPr>
@@ -12762,14 +12762,14 @@
           <w:sz w:val="21"/>
           <w:szCs w:val="21"/>
         </w:rPr>
-        <w:t xml:space="preserve">Educational Research Review</w:t>
-      </w:r>
-      <w:r>
-        <w:rPr>
-          <w:sz w:val="21"/>
-          <w:szCs w:val="21"/>
-        </w:rPr>
-        <w:t xml:space="preserve">, Vol. 31, 100355, https://www.sciencedirect.com/science/article/abs/pii/S1747938X19305597.</w:t>
+        <w:t xml:space="preserve">NSW Department of Education Annual Report 2023-24</w:t>
+      </w:r>
+      <w:r>
+        <w:rPr>
+          <w:sz w:val="21"/>
+          <w:szCs w:val="21"/>
+        </w:rPr>
+        <w:t xml:space="preserve">, Sydney, https://education.nsw.gov.au/content/dam/main-education/en/home/about-us/strategies-and-reports/annual-reports/nsw-doe-annual-report-2023-24.pdf (accessed on 4 August 2026).</w:t>
       </w:r>
     </w:p>
     <w:p>
@@ -12783,7 +12783,7 @@
           <w:sz w:val="21"/>
           <w:szCs w:val="21"/>
         </w:rPr>
-        <w:t xml:space="preserve">Nickow, A., P. Oreopoulos and V. Quan (2024), "The promise of tutoring for preK-12 learning: A systematic review and meta-analysis of the experimental evidence", </w:t>
+        <w:t xml:space="preserve">NSW Department of Education (2025), </w:t>
       </w:r>
       <w:r>
         <w:rPr>
@@ -12792,14 +12792,14 @@
           <w:sz w:val="21"/>
           <w:szCs w:val="21"/>
         </w:rPr>
-        <w:t xml:space="preserve">American Educational Research Journal</w:t>
-      </w:r>
-      <w:r>
-        <w:rPr>
-          <w:sz w:val="21"/>
-          <w:szCs w:val="21"/>
-        </w:rPr>
-        <w:t xml:space="preserve">, Vol. 61/1, pp. 74-107, https://journals.sagepub.com/doi/10.3102/00028312231208687.</w:t>
+        <w:t xml:space="preserve">Annual Report 2024-25</w:t>
+      </w:r>
+      <w:r>
+        <w:rPr>
+          <w:sz w:val="21"/>
+          <w:szCs w:val="21"/>
+        </w:rPr>
+        <w:t xml:space="preserve">, Sydney, https://education.nsw.gov.au/content/dam/main-education/en/home/about-us/strategies-and-reports/annual-reports/DoE_Annual_Report_2024-25.pdf (accessed on 4 August 2026).</w:t>
       </w:r>
     </w:p>
     <w:p>
@@ -12813,7 +12813,7 @@
           <w:sz w:val="21"/>
           <w:szCs w:val="21"/>
         </w:rPr>
-        <w:t xml:space="preserve">Nippon.com (2022), "Survey Reveals Teacher Shortage in Japan", 15 March 2022, https://www.nippon.com/en/japan-data/h01264/ (accessed on 5 August 2026).</w:t>
+        <w:t xml:space="preserve">NSW Department of Education (2026), "Returning teachers", teach.NSW webpage, last updated 8 July 2026, https://education.nsw.gov.au/teach-nsw/find-teaching-jobs/returning-teachers (accessed on 4 August 2026).</w:t>
       </w:r>
     </w:p>
     <w:p>
@@ -12827,7 +12827,7 @@
           <w:sz w:val="21"/>
           <w:szCs w:val="21"/>
         </w:rPr>
-        <w:t xml:space="preserve">Nippon.com (2026), "3,827 Teacher Positions Unfilled across Japan: 2025 Survey", https://www.nippon.com/en/news/yjj2026030500966/ (accessed on 5 August 2026).</w:t>
+        <w:t xml:space="preserve">NSW Government (2024), "Retired teachers return to classrooms as part of initiative to address shortage", media release, Minister for Education and Early Learning, 8 May 2024, https://www.nsw.gov.au/media-releases/retired-teachers-return-to-classrooms (accessed on 4 August 2026).</w:t>
       </w:r>
     </w:p>
     <w:p>
@@ -12841,23 +12841,7 @@
           <w:sz w:val="21"/>
           <w:szCs w:val="21"/>
         </w:rPr>
-        <w:t xml:space="preserve">NSW Department of Education (2024), </w:t>
-      </w:r>
-      <w:r>
-        <w:rPr>
-          <w:i/>
-          <w:iCs/>
-          <w:sz w:val="21"/>
-          <w:szCs w:val="21"/>
-        </w:rPr>
-        <w:t xml:space="preserve">NSW Department of Education Annual Report 2023-24</w:t>
-      </w:r>
-      <w:r>
-        <w:rPr>
-          <w:sz w:val="21"/>
-          <w:szCs w:val="21"/>
-        </w:rPr>
-        <w:t xml:space="preserve">, Sydney, https://education.nsw.gov.au/content/dam/main-education/en/home/about-us/strategies-and-reports/annual-reports/nsw-doe-annual-report-2023-24.pdf (accessed on 4 August 2026).</w:t>
+        <w:t xml:space="preserve">OCEOTA (2024), "OTF Decision on 50-day rule", Ontario Catholic English Occasional Teachers Association, 18 March 2024, http://oceota.com/2024/03/18/otf-decision-on-50-day-rule/ (accessed on 4 August 2026).</w:t>
       </w:r>
     </w:p>
     <w:p>
@@ -12871,7 +12855,7 @@
           <w:sz w:val="21"/>
           <w:szCs w:val="21"/>
         </w:rPr>
-        <w:t xml:space="preserve">NSW Department of Education (2025), </w:t>
+        <w:t xml:space="preserve">OECD (2005), </w:t>
       </w:r>
       <w:r>
         <w:rPr>
@@ -12880,14 +12864,14 @@
           <w:sz w:val="21"/>
           <w:szCs w:val="21"/>
         </w:rPr>
-        <w:t xml:space="preserve">Annual Report 2024-25</w:t>
-      </w:r>
-      <w:r>
-        <w:rPr>
-          <w:sz w:val="21"/>
-          <w:szCs w:val="21"/>
-        </w:rPr>
-        <w:t xml:space="preserve">, Sydney, https://education.nsw.gov.au/content/dam/main-education/en/home/about-us/strategies-and-reports/annual-reports/DoE_Annual_Report_2024-25.pdf (accessed on 4 August 2026).</w:t>
+        <w:t xml:space="preserve">Teachers Matter: Attracting, Developing and Retaining Effective Teachers</w:t>
+      </w:r>
+      <w:r>
+        <w:rPr>
+          <w:sz w:val="21"/>
+          <w:szCs w:val="21"/>
+        </w:rPr>
+        <w:t xml:space="preserve">, Education and Training Policy, OECD Publishing, Paris, https://doi.org/10.1787/9789264018044-en (accessed on 5 August 2026).</w:t>
       </w:r>
     </w:p>
     <w:p>
@@ -12901,7 +12885,23 @@
           <w:sz w:val="21"/>
           <w:szCs w:val="21"/>
         </w:rPr>
-        <w:t xml:space="preserve">NSW Department of Education (2026), "Returning teachers", teach.NSW webpage, last updated 8 July 2026, https://education.nsw.gov.au/teach-nsw/find-teaching-jobs/returning-teachers (accessed on 4 August 2026).</w:t>
+        <w:t xml:space="preserve">OECD (2020), </w:t>
+      </w:r>
+      <w:r>
+        <w:rPr>
+          <w:i/>
+          <w:iCs/>
+          <w:sz w:val="21"/>
+          <w:szCs w:val="21"/>
+        </w:rPr>
+        <w:t xml:space="preserve">TALIS 2018 Results (Volume II): Teachers and School Leaders as Valued Professionals</w:t>
+      </w:r>
+      <w:r>
+        <w:rPr>
+          <w:sz w:val="21"/>
+          <w:szCs w:val="21"/>
+        </w:rPr>
+        <w:t xml:space="preserve">, TALIS, OECD Publishing, Paris, https://doi.org/10.1787/19cf08df-en (report page: https://www.oecd.org/en/publications/talis-2018-results-volume-ii_19cf08df-en.html).</w:t>
       </w:r>
     </w:p>
     <w:p>
@@ -12915,7 +12915,23 @@
           <w:sz w:val="21"/>
           <w:szCs w:val="21"/>
         </w:rPr>
-        <w:t xml:space="preserve">NSW Government (2024), "Retired teachers return to classrooms as part of initiative to address shortage", media release, Minister for Education and Early Learning, 8 May 2024, https://www.nsw.gov.au/media-releases/retired-teachers-return-to-classrooms (accessed on 4 August 2026).</w:t>
+        <w:t xml:space="preserve">OECD (2023b), </w:t>
+      </w:r>
+      <w:r>
+        <w:rPr>
+          <w:i/>
+          <w:iCs/>
+          <w:sz w:val="21"/>
+          <w:szCs w:val="21"/>
+        </w:rPr>
+        <w:t xml:space="preserve">PISA 2022 Results (Volume II): Learning During – and From – Disruption</w:t>
+      </w:r>
+      <w:r>
+        <w:rPr>
+          <w:sz w:val="21"/>
+          <w:szCs w:val="21"/>
+        </w:rPr>
+        <w:t xml:space="preserve">, PISA, OECD Publishing, Paris, https://doi.org/10.1787/a97db61c-en (accessed on 5 August 2026).</w:t>
       </w:r>
     </w:p>
     <w:p>
@@ -12929,7 +12945,23 @@
           <w:sz w:val="21"/>
           <w:szCs w:val="21"/>
         </w:rPr>
-        <w:t xml:space="preserve">OCEOTA (2024), "OTF Decision on 50-day rule", Ontario Catholic English Occasional Teachers Association, 18 March 2024, http://oceota.com/2024/03/18/otf-decision-on-50-day-rule/ (accessed on 4 August 2026).</w:t>
+        <w:t xml:space="preserve">OECD (2024), </w:t>
+      </w:r>
+      <w:r>
+        <w:rPr>
+          <w:i/>
+          <w:iCs/>
+          <w:sz w:val="21"/>
+          <w:szCs w:val="21"/>
+        </w:rPr>
+        <w:t xml:space="preserve">Education Policy Outlook 2024: Reshaping Teaching into a Thriving Profession from ABCs to AI</w:t>
+      </w:r>
+      <w:r>
+        <w:rPr>
+          <w:sz w:val="21"/>
+          <w:szCs w:val="21"/>
+        </w:rPr>
+        <w:t xml:space="preserve">, OECD Publishing, Paris, https://doi.org/10.1787/dd5140e4-en (accessed on 5 August 2026).</w:t>
       </w:r>
     </w:p>
     <w:p>
@@ -12943,7 +12975,7 @@
           <w:sz w:val="21"/>
           <w:szCs w:val="21"/>
         </w:rPr>
-        <w:t xml:space="preserve">OECD (2005), </w:t>
+        <w:t xml:space="preserve">OECD (2025a), </w:t>
       </w:r>
       <w:r>
         <w:rPr>
@@ -12952,14 +12984,14 @@
           <w:sz w:val="21"/>
           <w:szCs w:val="21"/>
         </w:rPr>
-        <w:t xml:space="preserve">Teachers Matter: Attracting, Developing and Retaining Effective Teachers</w:t>
-      </w:r>
-      <w:r>
-        <w:rPr>
-          <w:sz w:val="21"/>
-          <w:szCs w:val="21"/>
-        </w:rPr>
-        <w:t xml:space="preserve">, Education and Training Policy, OECD Publishing, Paris, https://doi.org/10.1787/9789264018044-en (accessed on 5 August 2026).</w:t>
+        <w:t xml:space="preserve">Education at a Glance 2025: OECD Indicators</w:t>
+      </w:r>
+      <w:r>
+        <w:rPr>
+          <w:sz w:val="21"/>
+          <w:szCs w:val="21"/>
+        </w:rPr>
+        <w:t xml:space="preserve">, OECD Publishing, Paris, https://doi.org/10.1787/1c0d9c79-en (accessed on 5 August 2026).</w:t>
       </w:r>
     </w:p>
     <w:p>
@@ -12973,7 +13005,7 @@
           <w:sz w:val="21"/>
           <w:szCs w:val="21"/>
         </w:rPr>
-        <w:t xml:space="preserve">OECD (2019), </w:t>
+        <w:t xml:space="preserve">OECD (2025b), </w:t>
       </w:r>
       <w:r>
         <w:rPr>
@@ -12982,14 +13014,14 @@
           <w:sz w:val="21"/>
           <w:szCs w:val="21"/>
         </w:rPr>
-        <w:t xml:space="preserve">TALIS 2018 Results (Volume I): Teachers and School Leaders as Lifelong Learners</w:t>
-      </w:r>
-      <w:r>
-        <w:rPr>
-          <w:sz w:val="21"/>
-          <w:szCs w:val="21"/>
-        </w:rPr>
-        <w:t xml:space="preserve">, TALIS, OECD Publishing, Paris, https://doi.org/10.1787/1d0bc92a-en (accessed on 5 August 2026).</w:t>
+        <w:t xml:space="preserve">Results from TALIS 2024: The State of Teaching</w:t>
+      </w:r>
+      <w:r>
+        <w:rPr>
+          <w:sz w:val="21"/>
+          <w:szCs w:val="21"/>
+        </w:rPr>
+        <w:t xml:space="preserve">, TALIS, OECD Publishing, Paris, https://doi.org/10.1787/90df6235-en (accessed on 5 August 2026).</w:t>
       </w:r>
     </w:p>
     <w:p>
@@ -13003,7 +13035,7 @@
           <w:sz w:val="21"/>
           <w:szCs w:val="21"/>
         </w:rPr>
-        <w:t xml:space="preserve">OECD (2020), </w:t>
+        <w:t xml:space="preserve">Ontario Ministry of Education (2022), </w:t>
       </w:r>
       <w:r>
         <w:rPr>
@@ -13012,14 +13044,14 @@
           <w:sz w:val="21"/>
           <w:szCs w:val="21"/>
         </w:rPr>
-        <w:t xml:space="preserve">TALIS 2018 Results (Volume II): Teachers and School Leaders as Valued Professionals</w:t>
-      </w:r>
-      <w:r>
-        <w:rPr>
-          <w:sz w:val="21"/>
-          <w:szCs w:val="21"/>
-        </w:rPr>
-        <w:t xml:space="preserve">, TALIS, OECD Publishing, Paris, https://doi.org/10.1787/19cf08df-en (report page: https://www.oecd.org/en/publications/talis-2018-results-volume-ii_19cf08df-en.html).</w:t>
+        <w:t xml:space="preserve">Memorandum 2022:SB01 – Temporary Amendment to the Ontario Teachers' Pension Plan (OTPP) 95 Day Re-Employment Rule for the 2021-22 School Year – Reporting Requirements</w:t>
+      </w:r>
+      <w:r>
+        <w:rPr>
+          <w:sz w:val="21"/>
+          <w:szCs w:val="21"/>
+        </w:rPr>
+        <w:t xml:space="preserve">, 24 January 2022, https://efis.fma.csc.gov.on.ca/faab/Memos/SB2022/SB01_EN.pdf (accessed on 4 August 2026).</w:t>
       </w:r>
     </w:p>
     <w:p>
@@ -13033,201 +13065,7 @@
           <w:sz w:val="21"/>
           <w:szCs w:val="21"/>
         </w:rPr>
-        <w:t xml:space="preserve">OECD (2023a), </w:t>
-      </w:r>
-      <w:r>
-        <w:rPr>
-          <w:i/>
-          <w:iCs/>
-          <w:sz w:val="21"/>
-          <w:szCs w:val="21"/>
-        </w:rPr>
-        <w:t xml:space="preserve">PISA 2022 Results (Volume I): The State of Learning and Equity in Education</w:t>
-      </w:r>
-      <w:r>
-        <w:rPr>
-          <w:sz w:val="21"/>
-          <w:szCs w:val="21"/>
-        </w:rPr>
-        <w:t xml:space="preserve">, PISA, OECD Publishing, Paris, https://doi.org/10.1787/53f23881-en (report page: https://www.oecd.org/en/publications/pisa-2022-results-volume-i_53f23881-en.html) (accessed on 5 August 2026).</w:t>
-      </w:r>
-    </w:p>
-    <w:p>
-      <w:pPr>
-        <w:spacing w:after="120"/>
-        <w:ind w:left="567" w:hanging="567"/>
-        <w:jc w:val="left"/>
-      </w:pPr>
-      <w:r>
-        <w:rPr>
-          <w:sz w:val="21"/>
-          <w:szCs w:val="21"/>
-        </w:rPr>
-        <w:t xml:space="preserve">OECD (2023b), </w:t>
-      </w:r>
-      <w:r>
-        <w:rPr>
-          <w:i/>
-          <w:iCs/>
-          <w:sz w:val="21"/>
-          <w:szCs w:val="21"/>
-        </w:rPr>
-        <w:t xml:space="preserve">PISA 2022 Results (Volume II): Learning During – and From – Disruption</w:t>
-      </w:r>
-      <w:r>
-        <w:rPr>
-          <w:sz w:val="21"/>
-          <w:szCs w:val="21"/>
-        </w:rPr>
-        <w:t xml:space="preserve">, PISA, OECD Publishing, Paris, https://doi.org/10.1787/a97db61c-en (accessed on 5 August 2026).</w:t>
-      </w:r>
-    </w:p>
-    <w:p>
-      <w:pPr>
-        <w:spacing w:after="120"/>
-        <w:ind w:left="567" w:hanging="567"/>
-        <w:jc w:val="left"/>
-      </w:pPr>
-      <w:r>
-        <w:rPr>
-          <w:sz w:val="21"/>
-          <w:szCs w:val="21"/>
-        </w:rPr>
-        <w:t xml:space="preserve">OECD (2024), </w:t>
-      </w:r>
-      <w:r>
-        <w:rPr>
-          <w:i/>
-          <w:iCs/>
-          <w:sz w:val="21"/>
-          <w:szCs w:val="21"/>
-        </w:rPr>
-        <w:t xml:space="preserve">Education Policy Outlook 2024: Reshaping Teaching into a Thriving Profession from ABCs to AI</w:t>
-      </w:r>
-      <w:r>
-        <w:rPr>
-          <w:sz w:val="21"/>
-          <w:szCs w:val="21"/>
-        </w:rPr>
-        <w:t xml:space="preserve">, OECD Publishing, Paris, https://doi.org/10.1787/dd5140e4-en (accessed on 5 August 2026).</w:t>
-      </w:r>
-    </w:p>
-    <w:p>
-      <w:pPr>
-        <w:spacing w:after="120"/>
-        <w:ind w:left="567" w:hanging="567"/>
-        <w:jc w:val="left"/>
-      </w:pPr>
-      <w:r>
-        <w:rPr>
-          <w:sz w:val="21"/>
-          <w:szCs w:val="21"/>
-        </w:rPr>
-        <w:t xml:space="preserve">OECD (2025a), </w:t>
-      </w:r>
-      <w:r>
-        <w:rPr>
-          <w:i/>
-          <w:iCs/>
-          <w:sz w:val="21"/>
-          <w:szCs w:val="21"/>
-        </w:rPr>
-        <w:t xml:space="preserve">Education at a Glance 2025: OECD Indicators</w:t>
-      </w:r>
-      <w:r>
-        <w:rPr>
-          <w:sz w:val="21"/>
-          <w:szCs w:val="21"/>
-        </w:rPr>
-        <w:t xml:space="preserve">, OECD Publishing, Paris, https://doi.org/10.1787/1c0d9c79-en (accessed on 5 August 2026).</w:t>
-      </w:r>
-    </w:p>
-    <w:p>
-      <w:pPr>
-        <w:spacing w:after="120"/>
-        <w:ind w:left="567" w:hanging="567"/>
-        <w:jc w:val="left"/>
-      </w:pPr>
-      <w:r>
-        <w:rPr>
-          <w:sz w:val="21"/>
-          <w:szCs w:val="21"/>
-        </w:rPr>
-        <w:t xml:space="preserve">OECD (2025b), </w:t>
-      </w:r>
-      <w:r>
-        <w:rPr>
-          <w:i/>
-          <w:iCs/>
-          <w:sz w:val="21"/>
-          <w:szCs w:val="21"/>
-        </w:rPr>
-        <w:t xml:space="preserve">Results from TALIS 2024: The State of Teaching</w:t>
-      </w:r>
-      <w:r>
-        <w:rPr>
-          <w:sz w:val="21"/>
-          <w:szCs w:val="21"/>
-        </w:rPr>
-        <w:t xml:space="preserve">, TALIS, OECD Publishing, Paris, https://doi.org/10.1787/90df6235-en (accessed on 5 August 2026).</w:t>
-      </w:r>
-    </w:p>
-    <w:p>
-      <w:pPr>
-        <w:spacing w:after="120"/>
-        <w:ind w:left="567" w:hanging="567"/>
-        <w:jc w:val="left"/>
-      </w:pPr>
-      <w:r>
-        <w:rPr>
-          <w:sz w:val="21"/>
-          <w:szCs w:val="21"/>
-        </w:rPr>
-        <w:t xml:space="preserve">Ontario Ministry of Education (2022), </w:t>
-      </w:r>
-      <w:r>
-        <w:rPr>
-          <w:i/>
-          <w:iCs/>
-          <w:sz w:val="21"/>
-          <w:szCs w:val="21"/>
-        </w:rPr>
-        <w:t xml:space="preserve">Memorandum 2022:SB01 – Temporary Amendment to the Ontario Teachers' Pension Plan (OTPP) 95 Day Re-Employment Rule for the 2021-22 School Year – Reporting Requirements</w:t>
-      </w:r>
-      <w:r>
-        <w:rPr>
-          <w:sz w:val="21"/>
-          <w:szCs w:val="21"/>
-        </w:rPr>
-        <w:t xml:space="preserve">, 24 January 2022, https://efis.fma.csc.gov.on.ca/faab/Memos/SB2022/SB01_EN.pdf (accessed on 4 August 2026).</w:t>
-      </w:r>
-    </w:p>
-    <w:p>
-      <w:pPr>
-        <w:spacing w:after="120"/>
-        <w:ind w:left="567" w:hanging="567"/>
-        <w:jc w:val="left"/>
-      </w:pPr>
-      <w:r>
-        <w:rPr>
-          <w:sz w:val="21"/>
-          <w:szCs w:val="21"/>
-        </w:rPr>
         <w:t xml:space="preserve">Ontario Teachers' Pension Plan (2026), "Know your re-employment limit", https://otpp.com/en-ca/members/life-events/living-in-retirement/your-reemployment-limit/ (accessed on 4 August 2026).</w:t>
-      </w:r>
-    </w:p>
-    <w:p>
-      <w:pPr>
-        <w:spacing w:after="120"/>
-        <w:ind w:left="567" w:hanging="567"/>
-        <w:jc w:val="left"/>
-      </w:pPr>
-      <w:r>
-        <w:rPr>
-          <w:sz w:val="21"/>
-          <w:szCs w:val="21"/>
-        </w:rPr>
-        <w:t xml:space="preserve">OSSTF (n.d.), "Ontario Teachers' Pension Plan (OTPP)", Ontario Secondary School Teachers' Federation, https://www.osstf.on.ca/en-CA/services/pensions/ontario-teachers-pension-plan-otpp.aspx (accessed on 4 August 2026).</w:t>
       </w:r>
     </w:p>
     <w:p>

</xml_diff>

<commit_message>
v6 final: fact verification applied across all sections
180 factual claims verified against the research base by two
independent passes; 17 corrections applied. Substantive fixes:
the shortage claim now matches what the source states rather than
overstating it; two unsupported absolutes ('returns fell to zero',
'returns ended') replaced by the collapse the evidence records;
'disappointing' no longer attributed to sponsors who never said it;
England's adviser service correctly described as still operating;
Georgia's comparator count corrected to nine states; Resch's
abstract-only finding no longer overstated; Munnings (2026) added
and mis-cited ZNS Bahamas removed; editorial residue deleted.
Executive summary 998 words, abstract 149, references 121.

Co-Authored-By: Claude Fable 5 <noreply@anthropic.com>
Claude-Session: https://claude.ai/code/session_01WLCoJ9gmuQFp7YFhChmBui
</commit_message>
<xml_diff>
--- a/build/Former_Teachers_Policy_Paper_v6.docx
+++ b/build/Former_Teachers_Policy_Paper_v6.docx
@@ -629,7 +629,7 @@
         <w:jc w:val="both"/>
       </w:pPr>
       <w:r>
-        <w:t xml:space="preserve">Every year, substantial numbers of teachers leave the profession. Across the 19 OECD education systems with comparable data, 6.5% of fully qualified teachers left teaching in 2022/23. Teachers who leave form three populations, those who move to other jobs, those who withdraw from the labour market and those who retire, and the balance among them runs from systems where resignations account for more than four in five departures to systems where retirements exceed half. This policy paper compiles and analyses the international record of policies to re-attract former teachers, organised into five instrument families, together with the evidence on why teachers leave, where they go and what they can bring back.</w:t>
+        <w:t xml:space="preserve">Every year, substantial numbers of teachers leave the profession. Across the 19 OECD education systems with comparable data, 6.5% of fully qualified teachers left teaching in 2022/23. Teachers who leave form three populations, those who move to other jobs, those who withdraw from the labour market and those who retire; no cross-country source decomposes departures into all three, but the resignation-retirement balance runs from systems where resignations account for more than four in five departures to systems where retirements exceed half. This policy paper compiles and analyses the international record of policies to re-attract former teachers, organised into five instrument families, together with the evidence on why teachers leave, where they go and what they can bring back.</w:t>
       </w:r>
     </w:p>
     <w:p>
@@ -647,7 +647,7 @@
         <w:jc w:val="both"/>
       </w:pPr>
       <w:r>
-        <w:t xml:space="preserve">Most leavers keep working, and most stay close to education. Where linked administrative data exist, more than half of leavers remain in education broadly defined, typically without out-earning their former classroom posts, and around one fifth withdraw from paid work altogether. The stock these flows build is large, mostly of working age and formally still qualified, and in the one system to measure it, roughly half of the visible reserve held expired but restorable certificates. Return flows from such stocks are already substantial, about one third of new entrants in England and at times over a third of new hires in the United States. On what returners bring back, the strongest evidence concerns experience itself, which spills over to colleagues and their students, and structured tutoring, the one designed role tested at scale in randomised trials.</w:t>
+        <w:t xml:space="preserve">Most leavers keep working, and most stay close to education. Where linked administrative data exist, more than half of leavers remain in education broadly defined, typically without out-earning their former classroom posts, and around one fifth withdraw from paid work altogether. The stock these flows build is large, mostly of working age and formally still qualified, and in the one system to measure it roughly half held expired but restorable certificates. Return flows from such stocks are already substantial, about one third of new entrants in England and at times over a third of new hires in the United States. On what returners bring back, the strongest evidence concerns experience itself, which spills over to colleagues and their students, and structured tutoring, the one designed role tested at scale in randomised trials.</w:t>
       </w:r>
     </w:p>
     <w:p>
@@ -665,7 +665,7 @@
         <w:jc w:val="both"/>
       </w:pPr>
       <w:r>
-        <w:t xml:space="preserve">Money attached to the return has gone largely unclaimed where working conditions caused the exits. One government lowered its own subsidy ceilings because returners were not applying, and another filled less than a third of its returner-contract quota while thousands of serving teachers took a comparable payment to stay on, which suggests that preventing a departure is far easier than reversing one. In active recruitment and accompaniment schemes, interest is inexpensive to generate and conversion is the constraint; no scheme has measured whether its returners would have come back anyway, and published reporting has tended to stop within a year of the launch announcement. Return as a defined role is the only family with randomised evidence. A scripted, dosed tutoring role delivered by retired and substitute teachers reproduced its measured effect at scale, while a mentoring role left to the veteran's discretion was tested once and returned an indeterminate answer.</w:t>
+        <w:t xml:space="preserve">Money attached to the return has gone largely unclaimed where working conditions caused the exits. One government lowered its own subsidy ceilings because returners were not applying, and another filled less than a third of its returner-contract quota while thousands of serving teachers took a comparable payment to stay on, suggesting that preventing a departure is easier than reversing one. In active recruitment and accompaniment schemes, interest is inexpensive to generate and conversion is the constraint; no scheme has measured whether its returners would have come back anyway, and published reporting has tended to stop within a year of the launch announcement. Return as a defined role is the only family with randomised evidence. A scripted, dosed tutoring role delivered by retired and substitute teachers reproduced its measured effect at scale, while a mentoring role left to the veteran's discretion was tested once and returned an indeterminate answer.</w:t>
       </w:r>
     </w:p>
     <w:p>
@@ -737,7 +737,7 @@
         <w:jc w:val="both"/>
       </w:pPr>
       <w:r>
-        <w:t xml:space="preserve">Recruitment difficulties raise the stakes of this outflow. Most OECD countries face serious teacher shortages. The share of 15-year-old students in schools whose principals reported that instruction is hindered by a lack of teaching staff rose from 26% in 2018 to 47% in 2022, a perception measure, but one that rose by more than 30 percentage points in eight OECD countries (OECD, 2023b), and UNESCO projects a need for 44 million additional primary and secondary teachers worldwide by 2030, more than half of which is replacement of teachers who leave rather than expansion of the workforce (UNESCO and International Task Force on Teachers for Education 2030, 2024). The workforce doing the replacing is meanwhile ageing. Among European Union systems, ageing is most acute in Greece and Portugal, and in Italy teachers aged 55 and over significantly outnumber those under 30 (European Commission, 2023); in Germany, the 457 000 retired or pensioned teachers counted in 2021 stand against a serving workforce of roughly 800 000 (Deutsches Schulportal, 2023). Among serving teachers, 19% across OECD countries report a lot of stress at work, and one in five teachers under 30 intends to leave within five years (OECD, 2025b).</w:t>
+        <w:t xml:space="preserve">Recruitment difficulties raise the stakes of this outflow. Teacher shortages have become a pressing policy concern in most OECD countries (OECD, 2025a). The share of 15-year-old students in schools whose principals reported that instruction is hindered by a lack of teaching staff rose by 21 percentage points, from 26% in 2018 to 47% in 2022, a perception measure, but one that rose by more than 30 percentage points in eight OECD countries (OECD, 2025a; OECD, 2023b), and UNESCO projects a need for 44 million additional primary and secondary teachers worldwide by 2030, more than half of which is replacement of teachers who leave rather than expansion of the workforce (UNESCO and International Task Force on Teachers for Education 2030, 2024). The workforce doing the replacing is meanwhile ageing. Among European Union systems, ageing is most acute in Greece and Portugal, and in Italy teachers aged 55 and over significantly outnumber those under 30 (European Commission, 2023); in Germany, the 457 000 retired or pensioned teachers counted in 2021 stand against a serving workforce of roughly 800 000 (Deutsches Schulportal, 2023). Among serving teachers, 19% across OECD countries report a lot of stress at work, and one in five teachers under 30 intends to leave within five years (OECD, 2025b).</w:t>
       </w:r>
     </w:p>
     <w:p>
@@ -2585,7 +2585,7 @@
         <w:jc w:val="both"/>
       </w:pPr>
       <w:r>
-        <w:t xml:space="preserve">The economic evidence is substantial but geographically skewed. In the United States, each additional USD 1 000 of cost-of-living-adjusted salary is associated with a turnover reduction of 0.34 percentage points (Tan et al., 2026), and 33% of Michigan certificate-holders outside the classroom placed higher salary among their top three reasons for not teaching, in a survey whose 30% response rate its authors describe as unrepresentative (Lindsay, Gnedko-Berry and Wan, 2021). Causal estimates indicate that targeted payments do retain teachers. In England, a payment of GBP 2 000 a year after tax made eligible mathematics and physics teachers 23% less likely to leave (Sims and Benhenda, 2022), and bonus and loan-forgiveness schemes in Florida and North Carolina cut attrition in shortage subjects by roughly 9% to 17% (Feng and Sass, 2018; Clotfelter et al., 2008). These estimates price retention, however, and no quasi-experimental study anywhere directly prices re-entry incentives, which concern people who have already revealed a preference against current conditions. The weight of the evidence is also American, since 72 of the roughly 86 studies in the causal base are from the United States (Fleck et al., 2025), which cautions against reading the salary margin as universal.</w:t>
+        <w:t xml:space="preserve">The economic evidence is substantial but geographically skewed. In the United States, each additional USD 1 000 of cost-of-living-adjusted salary is associated with a turnover reduction of 0.34 percentage points (Tan et al., 2026), and 33% of Michigan certificate-holders outside the classroom placed higher salary among their top three reasons for not teaching, in a survey whose 30% response rate its authors describe as unrepresentative (Lindsay, Gnedko-Berry and Wan, 2021). Causal estimates indicate that targeted payments do retain teachers. In England, a payment of GBP 2 000 a year after tax made eligible early-career mathematics and physics teachers 23% less likely to leave in eligible years (Sims and Benhenda, 2022), and bonus and loan-forgiveness schemes in Florida and North Carolina cut attrition in shortage subjects by roughly 9% to 17%, and by as much as about 32% in the short run for a one-time Florida bonus (Feng and Sass, 2018; Clotfelter et al., 2008). These estimates price retention, however, and no quasi-experimental study anywhere directly prices re-entry incentives, which concern people who have already revealed a preference against current conditions. The weight of the evidence is also American, since 72 of the roughly 86 studies in the causal base are from the United States (Fleck et al., 2025), which cautions against reading the salary margin as universal.</w:t>
       </w:r>
     </w:p>
     <w:p>
@@ -2701,7 +2701,7 @@
         <w:jc w:val="both"/>
       </w:pPr>
       <w:r>
-        <w:t xml:space="preserve">The record these families have produced consists mainly of administrative take-up counts rather than evaluations, and the counts measure different outcomes against different denominators, so any comparative reading must stay modest. One pattern is nonetheless visible. Among the many campaigns implemented to attract teachers back, both those providing incentives and those easing certification, there is suggestive evidence that they weigh less than changes to the legal rules of the game, which appear more successful in re-attracting teachers. The largest documented return flows follow changes to pension and employment rules, while marketing-led and subsidy-led schemes have converted registrations into placements at rates their own sponsors describe as disappointing. That reading rests on uncontrolled episodes rather than on designed comparisons, and it is qualified wherever the underlying counts are missing or unpublished.</w:t>
+        <w:t xml:space="preserve">The record these families have produced consists mainly of administrative take-up counts rather than evaluations, and the counts measure different outcomes against different denominators, so any comparative reading must stay modest. One pattern is nonetheless visible. Among the many campaigns implemented to attract teachers back, both those providing incentives and those easing certification, there is suggestive evidence that they weigh less than changes to the legal rules of the game, which appear more successful in re-attracting teachers. The largest documented return flows follow changes to pension and employment rules, while marketing-led and subsidy-led schemes have converted registrations into placements at rates that their own evaluators and regulatory texts record as falling short of their targets. That reading rests on uncontrolled episodes rather than on designed comparisons, and it is qualified wherever the underlying counts are missing or unpublished.</w:t>
       </w:r>
     </w:p>
     <w:p>
@@ -6100,7 +6100,7 @@
         <w:jc w:val="both"/>
       </w:pPr>
       <w:r>
-        <w:t xml:space="preserve">The family's benchmark case is the return-to-work window that North Carolina (United States) operated between 1999 and 2009, the only pension-rule re-entry episode anywhere to have received a large-scale peer-reviewed evaluation (Box 1). Suspending the rule under which a full-time return cost a retiree the pension, without any bonus payment, drew roughly 3 500 retirees back into full-time posts over the decade, 2.1% of the sampled workforce, and returns ended when the window expired (Jarrold-Grapes and Mahler, 2024). The episode supports two claims found nowhere else at this scale. Removing the concurrency penalty can re-activate retirees in numbers that campaigns do not approach, and the returners flowed disproportionately to schools serving disadvantaged students without any mandate directing them there. What the evaluation cannot support is equally well defined, since the data contain no vacancy or achievement counterfactual, and some hires may have displaced other candidates.</w:t>
+        <w:t xml:space="preserve">The family's benchmark case is the return-to-work window that North Carolina (United States) operated between 1999 and 2009, the only pension-rule re-entry episode anywhere to have received a large-scale peer-reviewed evaluation (Box 1). Suspending the rule under which a full-time return cost a retiree the pension, without any bonus payment, drew roughly 3 500 retirees back into full-time posts over the decade, 2.1% of the sampled workforce, and the flow of returners collapsed when the window expired (Jarrold-Grapes and Mahler, 2024). The episode supports two claims found nowhere else at this scale. Removing the concurrency penalty can re-activate retirees in numbers that campaigns do not approach, and the returners flowed disproportionately to schools serving disadvantaged students without any mandate directing them there. What the evaluation cannot support is equally well defined, since the data contain no vacancy or achievement counterfactual, and some hires may have displaced other candidates.</w:t>
       </w:r>
     </w:p>
     <w:tbl>
@@ -6174,7 +6174,7 @@
                 <w:sz w:val="22"/>
                 <w:szCs w:val="22"/>
               </w:rPr>
-              <w:t xml:space="preserve">The evaluation, on administrative records covering about 169 000 teachers in 2 900 schools, counted roughly 3 500 returners over the decade. More than half of schools hired at least one, 54% of returners went back to their pre-retirement school, and returners were disproportionately Black, more likely to teach mathematics, and more likely to work in schools with higher shares of economically disadvantaged students. By 2009, just over 35% of teachers who had been retirement-eligible in the previous year were returning to full-time work; after the window closed, returns fell to zero. The authors note that the marginal cost of a returner is the salary difference relative to a novice, since the annuity is paid regardless. The data permit no conclusions about effects on vacancies or student achievement, and cannot rule out that some hires displaced other candidates.</w:t>
+              <w:t xml:space="preserve">The evaluation, on administrative records covering about 169 000 teachers in 2 900 schools, counted roughly 3 500 returners over the decade. More than half of schools hired at least one, 54% of returners went back to their pre-retirement school, and returners were disproportionately Black, more likely to teach mathematics, and more likely to work in schools with higher shares of economically disadvantaged students. By 2009, just over 35% of teachers who had been retirement-eligible in the previous year were returning to full-time work; the flow of returners collapsed once the window closed, although the concurrent-pay category itself ceased to exist at that point. The authors note that the marginal cost of a returner is the salary difference relative to a novice, since the annuity is paid regardless. The data permit no conclusions about effects on vacancies or student achievement, and cannot rule out that some hires displaced other candidates.</w:t>
             </w:r>
           </w:p>
           <w:p>
@@ -6203,7 +6203,7 @@
         <w:jc w:val="both"/>
       </w:pPr>
       <w:r>
-        <w:t xml:space="preserve">In Georgia (United States), a notable example of statutory self-evaluation, House Bill 385 allowed selected retirees to teach full-time on a full pension and wrote a performance audit into the statute itself (Box 2). The design stacked the exclusion dial, combining a long service threshold, a waiting period and a subject-and-region screen, the most restrictive combination among the eight southern states with comparable laws. The mandated audit counted 635 full-time returners over three fiscal years, under 1% of the workforce in any given year against roughly 6 000 vacant or not-fully-certified posts; it reported that nearly half of surveyed school systems said the statutory conditions had blocked a hire they would otherwise have made, and it judged the effect on the shortage and on the pension fund alike to be minimal (Georgia Department of Audits and Accounts, 2025). On the authority of an official audit rather than of advocacy, the case supports the claim that stacked eligibility screens depress take-up. It cannot show that a looser design would have filled the vacancies.</w:t>
+        <w:t xml:space="preserve">In Georgia (United States), a notable example of statutory self-evaluation, House Bill 385 allowed selected retirees to teach full-time on a full pension and wrote a performance audit into the statute itself (Box 2). The design stacked the exclusion dial, combining a long service threshold, a waiting period and a subject-and-region screen, the most restrictive combination among the nine southern states with comparable laws. The mandated audit counted 635 full-time returners over three fiscal years, under 1% of the workforce in any given year against roughly 6 000 vacant or not-fully-certified posts; it reported that nearly half of surveyed school systems said the statutory conditions had blocked a hire they would otherwise have made, and it judged the effect on the shortage and on the pension fund alike to be minimal (Georgia Department of Audits and Accounts, 2025). On the authority of an official audit rather than of advocacy, the case supports the claim that stacked eligibility screens depress take-up. It cannot show that a looser design would have filled the vacancies.</w:t>
       </w:r>
     </w:p>
     <w:tbl>
@@ -6537,7 +6537,7 @@
         <w:t xml:space="preserve">6</w:t>
       </w:r>
       <w:r>
-        <w:t xml:space="preserve"> The service has since been extended to all subjects and phases (Department for Education, 2023). Two features of the English record frame the whole family. Interest proved inexpensive to generate while conversion was the constraint, since expressions of interest far outstripped what the pilot could convert into posts; and by mid-2026 the government was reporting more returners than at any point in ten years without any returner-specific scheme in operation, an indication that the background return flow of roughly 17 000 teachers a year dwarfs anything the programmes themselves recorded (UK Parliament, 2026; Department for Education, 2023).</w:t>
+        <w:t xml:space="preserve"> The service has since been extended to all subjects and phases (Department for Education, 2023). Two features of the English record frame the whole family. Interest proved inexpensive to generate while conversion was the constraint, since expressions of interest far outstripped what the pilot could convert into posts; and by mid-2026 the government was reporting more returners than at any point in ten years, with no returner-specific bursary or successor programme announced beyond the standing adviser service, an indication that the background return flow of roughly 17 000 teachers a year dwarfs anything the programmes themselves recorded (UK Parliament, 2026; Department for Education, 2023).</w:t>
       </w:r>
     </w:p>
     <w:p>
@@ -6555,7 +6555,7 @@
         <w:jc w:val="both"/>
       </w:pPr>
       <w:r>
-        <w:t xml:space="preserve">Austria ran the same outreach without the funnel. Facing one of the highest vacancy rates in the OECD's most recent data collection, with unfilled positions equal to 107% of the previous year's teaching graduates, the nine regional education directorates acted as the retirement wave crested, under the federal "Klasse Job" umbrella; Vienna wrote directly to already-retired teachers, Salzburg contacted all recent retirees with transport tickets and premiums, Styria encouraged principals to approach teachers of retirement age, and Vorarlberg created a standing service point, "Arbeitsplatz Schule", that sends re-entry information out with the retirement paperwork (OECD, 2025a; APA/ORF, 2023). The Court of Audit subsequently counted 1 062 retired teachers resuming service nationwide across the six school years to 2023/24, against a workforce of roughly 123 000, with the peak in the pandemic-adjacent years and decline thereafter (Rechnungshof, 2025). The outreach cannot be credited with the returns, since the audited series begins four years before the letters. What qualitative evidence exists points away from marketing altogether, as episodic interviews with returning and non-returning retirees find the decision biographically rooted in individual, family, school and system factors, with continuing professional contact with the former school the main facilitator (Resch, 2025a; Resch, 2025b). The price the returner faces is meanwhile set by the crediting rule recorded in Table 3, under which formerly civil-servant teachers return at the starting salary.</w:t>
+        <w:t xml:space="preserve">Austria ran the same outreach without the funnel. Facing one of the highest vacancy rates in the OECD's most recent data collection, with unfilled positions equal to 107% of the previous year's teaching graduates, the nine regional education directorates acted as the retirement wave crested, under the federal "Klasse Job" umbrella; Vienna wrote directly to already-retired teachers, Salzburg contacted all recent retirees with transport tickets and premiums, Styria encouraged principals to approach teachers of retirement age, and Vorarlberg created a standing service point, "Arbeitsplatz Schule", that sends re-entry information out with the retirement paperwork (OECD, 2025a; APA/ORF, 2023). The Court of Audit subsequently counted 1 062 retired teachers resuming service nationwide across the six school years to 2023/24, against a workforce of roughly 123 000, with the peak in the pandemic-adjacent years and decline thereafter (Rechnungshof, 2025). The outreach cannot be credited with the returns, since the audited series begins four years before the letters. What qualitative evidence exists points away from marketing altogether, as episodic interviews with returning and non-returning retirees find the decision biographically rooted in individual, family, school and system factors, with continuing professional roles after retirement and continuing contact with the former school aiding the decision to return (Resch, 2025a; Resch, 2025b). The price the returner faces is meanwhile set by the crediting rule recorded in Table 3, under which formerly civil-servant teachers return at the starting salary.</w:t>
       </w:r>
     </w:p>
     <w:p>
@@ -9046,7 +9046,7 @@
         <w:jc w:val="both"/>
       </w:pPr>
       <w:r>
-        <w:t xml:space="preserve">The newest design in the family formalises the reserve itself. In the Bahamas, the "Teacher Reservist Program" announced in mid-2026 creates a standing register of qualified nationals, retired educators, trained teachers who left for other professions and recent graduates, whom schools can call on, with a multi-agency task force fast-tracking vetting and credential assessment, against a national shortfall of about 300 teachers across the archipelago's public schools (Cooper, 2026; ZNS Bahamas, 2026). The programme, still at announcement stage as of that date, has no published reservist counts. Its interest is the design contrast, a register that former teachers join once and remain reachable through, rather than a campaign that must find them each time a shortage recurs, and it formalises an existing reliance, since retired educators were already working full-time in supply roles (ZNS Bahamas, 2026).</w:t>
+        <w:t xml:space="preserve">The newest design in the family formalises the reserve itself. In the Bahamas, the "Teacher Reservist Program" announced in mid-2026 creates a standing register of qualified nationals, retired educators, trained teachers who left for other professions and recent graduates, whom schools can call on, with a multi-agency task force fast-tracking vetting and credential assessment, against a national shortfall of about 300 teachers across the archipelago's public schools (Cooper, 2026; ZNS Bahamas, 2026). The programme, still at announcement stage as of that date, has no published reservist counts. Its interest is the design contrast, a register that former teachers join once and remain reachable through, rather than a campaign that must find them each time a shortage recurs, and it formalises an existing reliance, since the teachers' union president reported in June 2026 that many retired educators were already working full-time in supply roles (Munnings, 2026).</w:t>
       </w:r>
     </w:p>
     <w:p>
@@ -9108,7 +9108,7 @@
         <w:jc w:val="both"/>
       </w:pPr>
       <w:r>
-        <w:t xml:space="preserve">Across the five families, the largest documented return flows follow changes to the statutory terms of re-employment. Among the many campaigns implemented to re-attract teachers, both those providing incentives and those easing certification, there is suggestive evidence that they weigh less than changes to the legal rules under which a returner is employed and paid, which appear more successful in bringing former teachers back (Section 3). The two documented episodes in which returns exceeded a fraction of one per cent of the relevant workforce, the North Carolina window and Japan's standing re-employment of retirees, each involved an institution changing rather than a message being sent (Jarrold-Grapes and Mahler, 2024; Sakuma and Shimazaki, 2024), while marketing-led and subsidy-led schemes converted registrations into placements at rates their own sponsors described as disappointing (Buchanan et al., 2018; Ministerie van OCW, 2019a). This reading rests on uncontrolled episodes counted against different outcome definitions (Table 4), so it orients policy without measuring it.</w:t>
+        <w:t xml:space="preserve">Across the five families, the largest documented return flows follow changes to the statutory terms of re-employment. Among the many campaigns implemented to re-attract teachers, both those providing incentives and those easing certification, there is suggestive evidence that they weigh less than changes to the legal rules under which a returner is employed and paid, which appear more successful in bringing former teachers back (Section 3). The two documented episodes in which returns exceeded a fraction of one per cent of the relevant workforce, the North Carolina window and Japan's standing re-employment of retirees, each involved an institution changing rather than a message being sent (Jarrold-Grapes and Mahler, 2024; Sakuma and Shimazaki, 2024), while marketing-led and subsidy-led schemes converted registrations into placements at rates that their own commissioned evaluator and regulatory texts record as falling short of their targets (Buchanan et al., 2018; Ministerie van OCW, 2019a). This reading rests on uncontrolled episodes counted against different outcome definitions (Table 4), so it orients policy without measuring it.</w:t>
       </w:r>
     </w:p>
     <w:p>
@@ -9179,7 +9179,7 @@
         <w:jc w:val="both"/>
       </w:pPr>
       <w:r>
-        <w:t xml:space="preserve">The record also documents conditions under which spending less is the better course. The Netherlands lowered its own subsidy ceilings because returners were not claiming the money (Ministerie van OCW, 2019a; Tweede Kamer, 2019), Dutch regional partnerships reported more returner applications than schools could absorb (De Jong et al., 2022), and England recorded its largest returner flows in years with no returner-specific scheme in operation (UK Parliament, 2026). An instrument whose budget goes unclaimed, or whose binding constraint is school absorption capacity, gains little from renewal. Policymakers must therefore be prepared to conclude that the appropriate expenditure on a given margin is zero, and to let an instrument lapse when its own take-up record points that way.</w:t>
+        <w:t xml:space="preserve">The record also documents conditions under which spending less is the better course. The Netherlands lowered its own subsidy ceilings because returners were not claiming the money (Ministerie van OCW, 2019a; Tweede Kamer, 2019), Dutch regional partnerships reported more returner applications than schools could absorb (De Jong et al., 2022), and and England recorded its largest returner flows in a decade with no returner-specific bursary or successor programme in operation beyond the standing adviser service (UK Parliament, 2026). An instrument whose budget goes unclaimed, or whose binding constraint is school absorption capacity, gains little from renewal. Policymakers must therefore be prepared to conclude that the appropriate expenditure on a given margin is zero, and to let an instrument lapse when its own take-up record points that way.</w:t>
       </w:r>
     </w:p>
     <w:p>
@@ -11047,7 +11047,7 @@
         <w:jc w:val="both"/>
       </w:pPr>
       <w:r>
-        <w:t xml:space="preserve">The research agenda that follows from this record is narrow and mostly inexpensive. No quasi-experimental study anywhere prices re-entry incentives, so the causal literature on teacher pay concerns retention only and cannot be carried over to people who have already left (Fleck et al., 2025). The decomposition of departures into the three exit populations likewise lacks a cross-country source; comparable data now separate resignations from retirements, without distinguishing job switchers from labour-market exits, so the composition question can be answered only nationally (OECD, 2025a). Take-up of licensing waivers remains unpublished in every system that grants them, although every waiver and every restored certificate passes through a regulator's records. The two cheapest items on this agenda, the netted count of the potential-returner population and the audit of the price of a return, rest on data systems that already exist, which suggests that the binding constraint on learning in this field is the assignment of duties rather than the cost of data.</w:t>
+        <w:t xml:space="preserve">The research agenda that follows from this record is narrow and mostly inexpensive. No quasi-experimental study anywhere prices re-entry incentives, so the causal literature on teacher pay concerns retention and entry only and cannot be carried over to people who have already left (Fleck et al., 2025). The decomposition of departures into the three exit populations likewise lacks a cross-country source; comparable data now separate resignations from retirements, without distinguishing job switchers from labour-market exits, so the composition question can be answered only nationally (OECD, 2025a). Take-up of licensing waivers remains unpublished in every system that grants them, although every waiver and every restored certificate passes through a regulator's records. The two cheapest items on this agenda, the netted count of the potential-returner population and the audit of the price of a return, rest on data systems that already exist, which suggests that the binding constraint on learning in this field is the assignment of duties rather than the cost of data.</w:t>
       </w:r>
     </w:p>
     <w:p>
@@ -12503,7 +12503,7 @@
           <w:sz w:val="21"/>
           <w:szCs w:val="21"/>
         </w:rPr>
-        <w:t xml:space="preserve">NCTL (2017), </w:t>
+        <w:t xml:space="preserve">Munnings, L. (2026), "BUT president urges minister to fix teacher shortages", </w:t>
       </w:r>
       <w:r>
         <w:rPr>
@@ -12512,14 +12512,14 @@
           <w:sz w:val="21"/>
           <w:szCs w:val="21"/>
         </w:rPr>
-        <w:t xml:space="preserve">Returners Engagement Programme Pilot: Programme and Application Guidance</w:t>
-      </w:r>
-      <w:r>
-        <w:rPr>
-          <w:sz w:val="21"/>
-          <w:szCs w:val="21"/>
-        </w:rPr>
-        <w:t xml:space="preserve">, National College for Teaching and Leadership, January 2017, https://dera.ioe.ac.uk/28252/1/returners-engagement-programme-application-guidance-cohort-2.pdf (accessed on 4 August 2026).</w:t>
+        <w:t xml:space="preserve">The Tribune</w:t>
+      </w:r>
+      <w:r>
+        <w:rPr>
+          <w:sz w:val="21"/>
+          <w:szCs w:val="21"/>
+        </w:rPr>
+        <w:t xml:space="preserve"> (Nassau), 8 June 2026, https://www.tribune242.com/news/2026/jun/08/but-president-urges-minister-to-fix-teacher-shortages/ (accessed on 5 August 2026).</w:t>
       </w:r>
     </w:p>
     <w:p>
@@ -12533,23 +12533,7 @@
           <w:sz w:val="21"/>
           <w:szCs w:val="21"/>
         </w:rPr>
-        <w:t xml:space="preserve">New Mexico Educational Retirement Board (2023), </w:t>
-      </w:r>
-      <w:r>
-        <w:rPr>
-          <w:i/>
-          <w:iCs/>
-          <w:sz w:val="21"/>
-          <w:szCs w:val="21"/>
-        </w:rPr>
-        <w:t xml:space="preserve">Discussion on Return to Work</w:t>
-      </w:r>
-      <w:r>
-        <w:rPr>
-          <w:sz w:val="21"/>
-          <w:szCs w:val="21"/>
-        </w:rPr>
-        <w:t xml:space="preserve">, presentation to the Investments &amp; Pensions Oversight Committee, 31 October 2023, https://www.nmlegis.gov/handouts/IPOC%20103123%20Item%204%20E.%20Educational%20Retirement%20Board--Return%20to%20Work.pdf (accessed on 4 August 2026).</w:t>
+        <w:t xml:space="preserve">NCES (2023), "Eight Percent of Public School Teachers Left Teaching in 2021, a Rate Unchanged Since Last Measured in 2012", press release, 13 December 2023, National Center for Education Statistics, Institute of Education Sciences, U.S. Department of Education, Washington, DC, https://ies.ed.gov/learn/press-release/eight-percent-public-school-teachers-left-teaching-2021-rate-unchanged-last-measured-2012 (accessed on 5 August 2026).</w:t>
       </w:r>
     </w:p>
     <w:p>
@@ -12563,7 +12547,23 @@
           <w:sz w:val="21"/>
           <w:szCs w:val="21"/>
         </w:rPr>
-        <w:t xml:space="preserve">New Mexico Educational Retirement Board (2025), "Recent Legislation / Legislative Proposals" (SB 133 of 2025), https://www.erb.nm.gov/legislation/recent-legislation-legislative-proposals/ (accessed on 4 August 2026).</w:t>
+        <w:t xml:space="preserve">NCTL (2017), </w:t>
+      </w:r>
+      <w:r>
+        <w:rPr>
+          <w:i/>
+          <w:iCs/>
+          <w:sz w:val="21"/>
+          <w:szCs w:val="21"/>
+        </w:rPr>
+        <w:t xml:space="preserve">Returners Engagement Programme Pilot: Programme and Application Guidance</w:t>
+      </w:r>
+      <w:r>
+        <w:rPr>
+          <w:sz w:val="21"/>
+          <w:szCs w:val="21"/>
+        </w:rPr>
+        <w:t xml:space="preserve">, National College for Teaching and Leadership, January 2017, https://dera.ioe.ac.uk/28252/1/returners-engagement-programme-application-guidance-cohort-2.pdf (accessed on 4 August 2026).</w:t>
       </w:r>
     </w:p>
     <w:p>
@@ -12577,7 +12577,23 @@
           <w:sz w:val="21"/>
           <w:szCs w:val="21"/>
         </w:rPr>
-        <w:t xml:space="preserve">New Mexico Legislature (2022), "HB 73: Educational Retirees Returning to Work", 2022 Regular Session, Chapter 20, https://www.nmlegis.gov/Legislation/Legislation?chamber=H&amp;legType=B&amp;legNo=73&amp;year=22 (accessed on 4 August 2026).</w:t>
+        <w:t xml:space="preserve">New Mexico Educational Retirement Board (2023), </w:t>
+      </w:r>
+      <w:r>
+        <w:rPr>
+          <w:i/>
+          <w:iCs/>
+          <w:sz w:val="21"/>
+          <w:szCs w:val="21"/>
+        </w:rPr>
+        <w:t xml:space="preserve">Discussion on Return to Work</w:t>
+      </w:r>
+      <w:r>
+        <w:rPr>
+          <w:sz w:val="21"/>
+          <w:szCs w:val="21"/>
+        </w:rPr>
+        <w:t xml:space="preserve">, presentation to the Investments &amp; Pensions Oversight Committee, 31 October 2023, https://www.nmlegis.gov/handouts/IPOC%20103123%20Item%204%20E.%20Educational%20Retirement%20Board--Return%20to%20Work.pdf (accessed on 4 August 2026).</w:t>
       </w:r>
     </w:p>
     <w:p>
@@ -12591,7 +12607,7 @@
           <w:sz w:val="21"/>
           <w:szCs w:val="21"/>
         </w:rPr>
-        <w:t xml:space="preserve">New Zealand Government (2025), "New Teacher Bonding Scheme supports schools and teachers", Beehive press release, Hon Erica Stanford, 19 September 2025, https://www.beehive.govt.nz/release/new-teacher-bonding-scheme-supports-schools-and-teachers.</w:t>
+        <w:t xml:space="preserve">New Mexico Educational Retirement Board (2025), "Recent Legislation / Legislative Proposals" (SB 133 of 2025), https://www.erb.nm.gov/legislation/recent-legislation-legislative-proposals/ (accessed on 4 August 2026).</w:t>
       </w:r>
     </w:p>
     <w:p>
@@ -12605,23 +12621,7 @@
           <w:sz w:val="21"/>
           <w:szCs w:val="21"/>
         </w:rPr>
-        <w:t xml:space="preserve">New Zealand Legislation (2020), </w:t>
-      </w:r>
-      <w:r>
-        <w:rPr>
-          <w:i/>
-          <w:iCs/>
-          <w:sz w:val="21"/>
-          <w:szCs w:val="21"/>
-        </w:rPr>
-        <w:t xml:space="preserve">Education and Training Act 2020</w:t>
-      </w:r>
-      <w:r>
-        <w:rPr>
-          <w:sz w:val="21"/>
-          <w:szCs w:val="21"/>
-        </w:rPr>
-        <w:t xml:space="preserve">, No 38, Schedule 3, https://www.legislation.govt.nz/act/public/2020/0038/latest/LMS261224.html (accessed on 4 August 2026).</w:t>
+        <w:t xml:space="preserve">New Mexico Legislature (2022), "HB 73: Educational Retirees Returning to Work", 2022 Regular Session, Chapter 20, https://www.nmlegis.gov/Legislation/Legislation?chamber=H&amp;legType=B&amp;legNo=73&amp;year=22 (accessed on 4 August 2026).</w:t>
       </w:r>
     </w:p>
     <w:p>
@@ -12635,7 +12635,7 @@
           <w:sz w:val="21"/>
           <w:szCs w:val="21"/>
         </w:rPr>
-        <w:t xml:space="preserve">New Zealand Ministry of Education (2026), "Looking for a relief teacher", Education Workforce website, Te Tāhuhu o te Mātauranga, updated 18 June 2026, https://workforce.education.govt.nz/principals-and-schools/local-employment-and-recruitment-support/looking-relief-teacher (accessed on 4 August 2026).</w:t>
+        <w:t xml:space="preserve">New Zealand Government (2025), "New Teacher Bonding Scheme supports schools and teachers", Beehive press release, Hon Erica Stanford, 19 September 2025, https://www.beehive.govt.nz/release/new-teacher-bonding-scheme-supports-schools-and-teachers.</w:t>
       </w:r>
     </w:p>
     <w:p>
@@ -12649,7 +12649,7 @@
           <w:sz w:val="21"/>
           <w:szCs w:val="21"/>
         </w:rPr>
-        <w:t xml:space="preserve">Nguyen, T. D., E. Bettini, C. Redding and A. F. Gilmour (2025), "Comparing Teacher Turnover Intentions to Actual Turnover: Cautions and Lessons for the Field", </w:t>
+        <w:t xml:space="preserve">New Zealand Legislation (2020), </w:t>
       </w:r>
       <w:r>
         <w:rPr>
@@ -12658,14 +12658,14 @@
           <w:sz w:val="21"/>
           <w:szCs w:val="21"/>
         </w:rPr>
-        <w:t xml:space="preserve">Educational Evaluation and Policy Analysis</w:t>
-      </w:r>
-      <w:r>
-        <w:rPr>
-          <w:sz w:val="21"/>
-          <w:szCs w:val="21"/>
-        </w:rPr>
-        <w:t xml:space="preserve">, https://journals.sagepub.com/doi/abs/10.3102/01623737241249459.</w:t>
+        <w:t xml:space="preserve">Education and Training Act 2020</w:t>
+      </w:r>
+      <w:r>
+        <w:rPr>
+          <w:sz w:val="21"/>
+          <w:szCs w:val="21"/>
+        </w:rPr>
+        <w:t xml:space="preserve">, No 38, Schedule 3, https://www.legislation.govt.nz/act/public/2020/0038/latest/LMS261224.html (accessed on 4 August 2026).</w:t>
       </w:r>
     </w:p>
     <w:p>
@@ -12679,23 +12679,7 @@
           <w:sz w:val="21"/>
           <w:szCs w:val="21"/>
         </w:rPr>
-        <w:t xml:space="preserve">Nguyen, T. D., L. D. Pham, M. Crouch and M. G. Springer (2020), "The correlates of teacher turnover: An updated and expanded meta-analysis of the literature", </w:t>
-      </w:r>
-      <w:r>
-        <w:rPr>
-          <w:i/>
-          <w:iCs/>
-          <w:sz w:val="21"/>
-          <w:szCs w:val="21"/>
-        </w:rPr>
-        <w:t xml:space="preserve">Educational Research Review</w:t>
-      </w:r>
-      <w:r>
-        <w:rPr>
-          <w:sz w:val="21"/>
-          <w:szCs w:val="21"/>
-        </w:rPr>
-        <w:t xml:space="preserve">, Vol. 31, 100355, https://www.sciencedirect.com/science/article/abs/pii/S1747938X19305597.</w:t>
+        <w:t xml:space="preserve">New Zealand Ministry of Education (2026), "Looking for a relief teacher", Education Workforce website, Te Tāhuhu o te Mātauranga, updated 18 June 2026, https://workforce.education.govt.nz/principals-and-schools/local-employment-and-recruitment-support/looking-relief-teacher (accessed on 4 August 2026).</w:t>
       </w:r>
     </w:p>
     <w:p>
@@ -12709,7 +12693,7 @@
           <w:sz w:val="21"/>
           <w:szCs w:val="21"/>
         </w:rPr>
-        <w:t xml:space="preserve">Nickow, A., P. Oreopoulos and V. Quan (2024), "The promise of tutoring for preK-12 learning: A systematic review and meta-analysis of the experimental evidence", </w:t>
+        <w:t xml:space="preserve">Nguyen, T. D., E. Bettini, C. Redding and A. F. Gilmour (2025), "Comparing Teacher Turnover Intentions to Actual Turnover: Cautions and Lessons for the Field", </w:t>
       </w:r>
       <w:r>
         <w:rPr>
@@ -12718,14 +12702,14 @@
           <w:sz w:val="21"/>
           <w:szCs w:val="21"/>
         </w:rPr>
-        <w:t xml:space="preserve">American Educational Research Journal</w:t>
-      </w:r>
-      <w:r>
-        <w:rPr>
-          <w:sz w:val="21"/>
-          <w:szCs w:val="21"/>
-        </w:rPr>
-        <w:t xml:space="preserve">, Vol. 61/1, pp. 74-107, https://journals.sagepub.com/doi/10.3102/00028312231208687.</w:t>
+        <w:t xml:space="preserve">Educational Evaluation and Policy Analysis</w:t>
+      </w:r>
+      <w:r>
+        <w:rPr>
+          <w:sz w:val="21"/>
+          <w:szCs w:val="21"/>
+        </w:rPr>
+        <w:t xml:space="preserve">, https://journals.sagepub.com/doi/abs/10.3102/01623737241249459.</w:t>
       </w:r>
     </w:p>
     <w:p>
@@ -12739,7 +12723,23 @@
           <w:sz w:val="21"/>
           <w:szCs w:val="21"/>
         </w:rPr>
-        <w:t xml:space="preserve">Nippon.com (2026), "3,827 Teacher Positions Unfilled across Japan: 2025 Survey", https://www.nippon.com/en/news/yjj2026030500966/ (accessed on 5 August 2026).</w:t>
+        <w:t xml:space="preserve">Nguyen, T. D., L. D. Pham, M. Crouch and M. G. Springer (2020), "The correlates of teacher turnover: An updated and expanded meta-analysis of the literature", </w:t>
+      </w:r>
+      <w:r>
+        <w:rPr>
+          <w:i/>
+          <w:iCs/>
+          <w:sz w:val="21"/>
+          <w:szCs w:val="21"/>
+        </w:rPr>
+        <w:t xml:space="preserve">Educational Research Review</w:t>
+      </w:r>
+      <w:r>
+        <w:rPr>
+          <w:sz w:val="21"/>
+          <w:szCs w:val="21"/>
+        </w:rPr>
+        <w:t xml:space="preserve">, Vol. 31, 100355, https://www.sciencedirect.com/science/article/abs/pii/S1747938X19305597.</w:t>
       </w:r>
     </w:p>
     <w:p>
@@ -12753,7 +12753,7 @@
           <w:sz w:val="21"/>
           <w:szCs w:val="21"/>
         </w:rPr>
-        <w:t xml:space="preserve">NSW Department of Education (2024), </w:t>
+        <w:t xml:space="preserve">Nickow, A., P. Oreopoulos and V. Quan (2024), "The promise of tutoring for preK-12 learning: A systematic review and meta-analysis of the experimental evidence", </w:t>
       </w:r>
       <w:r>
         <w:rPr>
@@ -12762,14 +12762,14 @@
           <w:sz w:val="21"/>
           <w:szCs w:val="21"/>
         </w:rPr>
-        <w:t xml:space="preserve">NSW Department of Education Annual Report 2023-24</w:t>
-      </w:r>
-      <w:r>
-        <w:rPr>
-          <w:sz w:val="21"/>
-          <w:szCs w:val="21"/>
-        </w:rPr>
-        <w:t xml:space="preserve">, Sydney, https://education.nsw.gov.au/content/dam/main-education/en/home/about-us/strategies-and-reports/annual-reports/nsw-doe-annual-report-2023-24.pdf (accessed on 4 August 2026).</w:t>
+        <w:t xml:space="preserve">American Educational Research Journal</w:t>
+      </w:r>
+      <w:r>
+        <w:rPr>
+          <w:sz w:val="21"/>
+          <w:szCs w:val="21"/>
+        </w:rPr>
+        <w:t xml:space="preserve">, Vol. 61/1, pp. 74-107, https://journals.sagepub.com/doi/10.3102/00028312231208687.</w:t>
       </w:r>
     </w:p>
     <w:p>
@@ -12783,23 +12783,7 @@
           <w:sz w:val="21"/>
           <w:szCs w:val="21"/>
         </w:rPr>
-        <w:t xml:space="preserve">NSW Department of Education (2025), </w:t>
-      </w:r>
-      <w:r>
-        <w:rPr>
-          <w:i/>
-          <w:iCs/>
-          <w:sz w:val="21"/>
-          <w:szCs w:val="21"/>
-        </w:rPr>
-        <w:t xml:space="preserve">Annual Report 2024-25</w:t>
-      </w:r>
-      <w:r>
-        <w:rPr>
-          <w:sz w:val="21"/>
-          <w:szCs w:val="21"/>
-        </w:rPr>
-        <w:t xml:space="preserve">, Sydney, https://education.nsw.gov.au/content/dam/main-education/en/home/about-us/strategies-and-reports/annual-reports/DoE_Annual_Report_2024-25.pdf (accessed on 4 August 2026).</w:t>
+        <w:t xml:space="preserve">Nippon.com (2026), "3,827 Teacher Positions Unfilled across Japan: 2025 Survey", https://www.nippon.com/en/news/yjj2026030500966/ (accessed on 5 August 2026).</w:t>
       </w:r>
     </w:p>
     <w:p>
@@ -12813,7 +12797,23 @@
           <w:sz w:val="21"/>
           <w:szCs w:val="21"/>
         </w:rPr>
-        <w:t xml:space="preserve">NSW Department of Education (2026), "Returning teachers", teach.NSW webpage, last updated 8 July 2026, https://education.nsw.gov.au/teach-nsw/find-teaching-jobs/returning-teachers (accessed on 4 August 2026).</w:t>
+        <w:t xml:space="preserve">NSW Department of Education (2024), </w:t>
+      </w:r>
+      <w:r>
+        <w:rPr>
+          <w:i/>
+          <w:iCs/>
+          <w:sz w:val="21"/>
+          <w:szCs w:val="21"/>
+        </w:rPr>
+        <w:t xml:space="preserve">NSW Department of Education Annual Report 2023-24</w:t>
+      </w:r>
+      <w:r>
+        <w:rPr>
+          <w:sz w:val="21"/>
+          <w:szCs w:val="21"/>
+        </w:rPr>
+        <w:t xml:space="preserve">, Sydney, https://education.nsw.gov.au/content/dam/main-education/en/home/about-us/strategies-and-reports/annual-reports/nsw-doe-annual-report-2023-24.pdf (accessed on 4 August 2026).</w:t>
       </w:r>
     </w:p>
     <w:p>
@@ -12827,7 +12827,23 @@
           <w:sz w:val="21"/>
           <w:szCs w:val="21"/>
         </w:rPr>
-        <w:t xml:space="preserve">NSW Government (2024), "Retired teachers return to classrooms as part of initiative to address shortage", media release, Minister for Education and Early Learning, 8 May 2024, https://www.nsw.gov.au/media-releases/retired-teachers-return-to-classrooms (accessed on 4 August 2026).</w:t>
+        <w:t xml:space="preserve">NSW Department of Education (2025), </w:t>
+      </w:r>
+      <w:r>
+        <w:rPr>
+          <w:i/>
+          <w:iCs/>
+          <w:sz w:val="21"/>
+          <w:szCs w:val="21"/>
+        </w:rPr>
+        <w:t xml:space="preserve">Annual Report 2024-25</w:t>
+      </w:r>
+      <w:r>
+        <w:rPr>
+          <w:sz w:val="21"/>
+          <w:szCs w:val="21"/>
+        </w:rPr>
+        <w:t xml:space="preserve">, Sydney, https://education.nsw.gov.au/content/dam/main-education/en/home/about-us/strategies-and-reports/annual-reports/DoE_Annual_Report_2024-25.pdf (accessed on 4 August 2026).</w:t>
       </w:r>
     </w:p>
     <w:p>
@@ -12841,7 +12857,7 @@
           <w:sz w:val="21"/>
           <w:szCs w:val="21"/>
         </w:rPr>
-        <w:t xml:space="preserve">OCEOTA (2024), "OTF Decision on 50-day rule", Ontario Catholic English Occasional Teachers Association, 18 March 2024, http://oceota.com/2024/03/18/otf-decision-on-50-day-rule/ (accessed on 4 August 2026).</w:t>
+        <w:t xml:space="preserve">NSW Department of Education (2026), "Returning teachers", teach.NSW webpage, last updated 8 July 2026, https://education.nsw.gov.au/teach-nsw/find-teaching-jobs/returning-teachers (accessed on 4 August 2026).</w:t>
       </w:r>
     </w:p>
     <w:p>
@@ -12855,23 +12871,7 @@
           <w:sz w:val="21"/>
           <w:szCs w:val="21"/>
         </w:rPr>
-        <w:t xml:space="preserve">OECD (2005), </w:t>
-      </w:r>
-      <w:r>
-        <w:rPr>
-          <w:i/>
-          <w:iCs/>
-          <w:sz w:val="21"/>
-          <w:szCs w:val="21"/>
-        </w:rPr>
-        <w:t xml:space="preserve">Teachers Matter: Attracting, Developing and Retaining Effective Teachers</w:t>
-      </w:r>
-      <w:r>
-        <w:rPr>
-          <w:sz w:val="21"/>
-          <w:szCs w:val="21"/>
-        </w:rPr>
-        <w:t xml:space="preserve">, Education and Training Policy, OECD Publishing, Paris, https://doi.org/10.1787/9789264018044-en (accessed on 5 August 2026).</w:t>
+        <w:t xml:space="preserve">NSW Government (2024), "Retired teachers return to classrooms as part of initiative to address shortage", media release, Minister for Education and Early Learning, 8 May 2024, https://www.nsw.gov.au/media-releases/retired-teachers-return-to-classrooms (accessed on 4 August 2026).</w:t>
       </w:r>
     </w:p>
     <w:p>
@@ -12885,23 +12885,7 @@
           <w:sz w:val="21"/>
           <w:szCs w:val="21"/>
         </w:rPr>
-        <w:t xml:space="preserve">OECD (2020), </w:t>
-      </w:r>
-      <w:r>
-        <w:rPr>
-          <w:i/>
-          <w:iCs/>
-          <w:sz w:val="21"/>
-          <w:szCs w:val="21"/>
-        </w:rPr>
-        <w:t xml:space="preserve">TALIS 2018 Results (Volume II): Teachers and School Leaders as Valued Professionals</w:t>
-      </w:r>
-      <w:r>
-        <w:rPr>
-          <w:sz w:val="21"/>
-          <w:szCs w:val="21"/>
-        </w:rPr>
-        <w:t xml:space="preserve">, TALIS, OECD Publishing, Paris, https://doi.org/10.1787/19cf08df-en (report page: https://www.oecd.org/en/publications/talis-2018-results-volume-ii_19cf08df-en.html).</w:t>
+        <w:t xml:space="preserve">OCEOTA (2024), "OTF Decision on 50-day rule", Ontario Catholic English Occasional Teachers Association, 18 March 2024, http://oceota.com/2024/03/18/otf-decision-on-50-day-rule/ (accessed on 4 August 2026).</w:t>
       </w:r>
     </w:p>
     <w:p>
@@ -12915,7 +12899,7 @@
           <w:sz w:val="21"/>
           <w:szCs w:val="21"/>
         </w:rPr>
-        <w:t xml:space="preserve">OECD (2023b), </w:t>
+        <w:t xml:space="preserve">OECD (2005), </w:t>
       </w:r>
       <w:r>
         <w:rPr>
@@ -12924,14 +12908,14 @@
           <w:sz w:val="21"/>
           <w:szCs w:val="21"/>
         </w:rPr>
-        <w:t xml:space="preserve">PISA 2022 Results (Volume II): Learning During – and From – Disruption</w:t>
-      </w:r>
-      <w:r>
-        <w:rPr>
-          <w:sz w:val="21"/>
-          <w:szCs w:val="21"/>
-        </w:rPr>
-        <w:t xml:space="preserve">, PISA, OECD Publishing, Paris, https://doi.org/10.1787/a97db61c-en (accessed on 5 August 2026).</w:t>
+        <w:t xml:space="preserve">Teachers Matter: Attracting, Developing and Retaining Effective Teachers</w:t>
+      </w:r>
+      <w:r>
+        <w:rPr>
+          <w:sz w:val="21"/>
+          <w:szCs w:val="21"/>
+        </w:rPr>
+        <w:t xml:space="preserve">, Education and Training Policy, OECD Publishing, Paris, https://doi.org/10.1787/9789264018044-en (accessed on 5 August 2026).</w:t>
       </w:r>
     </w:p>
     <w:p>
@@ -12945,7 +12929,7 @@
           <w:sz w:val="21"/>
           <w:szCs w:val="21"/>
         </w:rPr>
-        <w:t xml:space="preserve">OECD (2024), </w:t>
+        <w:t xml:space="preserve">OECD (2020), </w:t>
       </w:r>
       <w:r>
         <w:rPr>
@@ -12954,14 +12938,14 @@
           <w:sz w:val="21"/>
           <w:szCs w:val="21"/>
         </w:rPr>
-        <w:t xml:space="preserve">Education Policy Outlook 2024: Reshaping Teaching into a Thriving Profession from ABCs to AI</w:t>
-      </w:r>
-      <w:r>
-        <w:rPr>
-          <w:sz w:val="21"/>
-          <w:szCs w:val="21"/>
-        </w:rPr>
-        <w:t xml:space="preserve">, OECD Publishing, Paris, https://doi.org/10.1787/dd5140e4-en (accessed on 5 August 2026).</w:t>
+        <w:t xml:space="preserve">TALIS 2018 Results (Volume II): Teachers and School Leaders as Valued Professionals</w:t>
+      </w:r>
+      <w:r>
+        <w:rPr>
+          <w:sz w:val="21"/>
+          <w:szCs w:val="21"/>
+        </w:rPr>
+        <w:t xml:space="preserve">, TALIS, OECD Publishing, Paris, https://doi.org/10.1787/19cf08df-en (report page: https://www.oecd.org/en/publications/talis-2018-results-volume-ii_19cf08df-en.html).</w:t>
       </w:r>
     </w:p>
     <w:p>
@@ -12975,7 +12959,7 @@
           <w:sz w:val="21"/>
           <w:szCs w:val="21"/>
         </w:rPr>
-        <w:t xml:space="preserve">OECD (2025a), </w:t>
+        <w:t xml:space="preserve">OECD (2023b), </w:t>
       </w:r>
       <w:r>
         <w:rPr>
@@ -12984,14 +12968,14 @@
           <w:sz w:val="21"/>
           <w:szCs w:val="21"/>
         </w:rPr>
-        <w:t xml:space="preserve">Education at a Glance 2025: OECD Indicators</w:t>
-      </w:r>
-      <w:r>
-        <w:rPr>
-          <w:sz w:val="21"/>
-          <w:szCs w:val="21"/>
-        </w:rPr>
-        <w:t xml:space="preserve">, OECD Publishing, Paris, https://doi.org/10.1787/1c0d9c79-en (accessed on 5 August 2026).</w:t>
+        <w:t xml:space="preserve">PISA 2022 Results (Volume II): Learning During – and From – Disruption</w:t>
+      </w:r>
+      <w:r>
+        <w:rPr>
+          <w:sz w:val="21"/>
+          <w:szCs w:val="21"/>
+        </w:rPr>
+        <w:t xml:space="preserve">, PISA, OECD Publishing, Paris, https://doi.org/10.1787/a97db61c-en (accessed on 5 August 2026).</w:t>
       </w:r>
     </w:p>
     <w:p>
@@ -13005,7 +12989,7 @@
           <w:sz w:val="21"/>
           <w:szCs w:val="21"/>
         </w:rPr>
-        <w:t xml:space="preserve">OECD (2025b), </w:t>
+        <w:t xml:space="preserve">OECD (2024), </w:t>
       </w:r>
       <w:r>
         <w:rPr>
@@ -13014,14 +12998,14 @@
           <w:sz w:val="21"/>
           <w:szCs w:val="21"/>
         </w:rPr>
-        <w:t xml:space="preserve">Results from TALIS 2024: The State of Teaching</w:t>
-      </w:r>
-      <w:r>
-        <w:rPr>
-          <w:sz w:val="21"/>
-          <w:szCs w:val="21"/>
-        </w:rPr>
-        <w:t xml:space="preserve">, TALIS, OECD Publishing, Paris, https://doi.org/10.1787/90df6235-en (accessed on 5 August 2026).</w:t>
+        <w:t xml:space="preserve">Education Policy Outlook 2024: Reshaping Teaching into a Thriving Profession from ABCs to AI</w:t>
+      </w:r>
+      <w:r>
+        <w:rPr>
+          <w:sz w:val="21"/>
+          <w:szCs w:val="21"/>
+        </w:rPr>
+        <w:t xml:space="preserve">, OECD Publishing, Paris, https://doi.org/10.1787/dd5140e4-en (accessed on 5 August 2026).</w:t>
       </w:r>
     </w:p>
     <w:p>
@@ -13035,7 +13019,7 @@
           <w:sz w:val="21"/>
           <w:szCs w:val="21"/>
         </w:rPr>
-        <w:t xml:space="preserve">Ontario Ministry of Education (2022), </w:t>
+        <w:t xml:space="preserve">OECD (2025a), </w:t>
       </w:r>
       <w:r>
         <w:rPr>
@@ -13044,14 +13028,14 @@
           <w:sz w:val="21"/>
           <w:szCs w:val="21"/>
         </w:rPr>
-        <w:t xml:space="preserve">Memorandum 2022:SB01 – Temporary Amendment to the Ontario Teachers' Pension Plan (OTPP) 95 Day Re-Employment Rule for the 2021-22 School Year – Reporting Requirements</w:t>
-      </w:r>
-      <w:r>
-        <w:rPr>
-          <w:sz w:val="21"/>
-          <w:szCs w:val="21"/>
-        </w:rPr>
-        <w:t xml:space="preserve">, 24 January 2022, https://efis.fma.csc.gov.on.ca/faab/Memos/SB2022/SB01_EN.pdf (accessed on 4 August 2026).</w:t>
+        <w:t xml:space="preserve">Education at a Glance 2025: OECD Indicators</w:t>
+      </w:r>
+      <w:r>
+        <w:rPr>
+          <w:sz w:val="21"/>
+          <w:szCs w:val="21"/>
+        </w:rPr>
+        <w:t xml:space="preserve">, OECD Publishing, Paris, https://doi.org/10.1787/1c0d9c79-en (accessed on 5 August 2026).</w:t>
       </w:r>
     </w:p>
     <w:p>
@@ -13065,7 +13049,23 @@
           <w:sz w:val="21"/>
           <w:szCs w:val="21"/>
         </w:rPr>
-        <w:t xml:space="preserve">Ontario Teachers' Pension Plan (2026), "Know your re-employment limit", https://otpp.com/en-ca/members/life-events/living-in-retirement/your-reemployment-limit/ (accessed on 4 August 2026).</w:t>
+        <w:t xml:space="preserve">OECD (2025b), </w:t>
+      </w:r>
+      <w:r>
+        <w:rPr>
+          <w:i/>
+          <w:iCs/>
+          <w:sz w:val="21"/>
+          <w:szCs w:val="21"/>
+        </w:rPr>
+        <w:t xml:space="preserve">Results from TALIS 2024: The State of Teaching</w:t>
+      </w:r>
+      <w:r>
+        <w:rPr>
+          <w:sz w:val="21"/>
+          <w:szCs w:val="21"/>
+        </w:rPr>
+        <w:t xml:space="preserve">, TALIS, OECD Publishing, Paris, https://doi.org/10.1787/90df6235-en (accessed on 5 August 2026).</w:t>
       </w:r>
     </w:p>
     <w:p>
@@ -13079,7 +13079,23 @@
           <w:sz w:val="21"/>
           <w:szCs w:val="21"/>
         </w:rPr>
-        <w:t xml:space="preserve">OTF (2023), "50-Day re-employment rule increased to 95 days for some OTPP retirees until June 30, 2023", Ontario Teachers' Federation, https://www.otffeo.on.ca/en/news/50-day-re-employment-rule-increased-to-95-days-for-some-otpp-retirees-until-june-30-2023/ (accessed on 4 August 2026).</w:t>
+        <w:t xml:space="preserve">Ontario Ministry of Education (2022), </w:t>
+      </w:r>
+      <w:r>
+        <w:rPr>
+          <w:i/>
+          <w:iCs/>
+          <w:sz w:val="21"/>
+          <w:szCs w:val="21"/>
+        </w:rPr>
+        <w:t xml:space="preserve">Memorandum 2022:SB01 – Temporary Amendment to the Ontario Teachers' Pension Plan (OTPP) 95 Day Re-Employment Rule for the 2021-22 School Year – Reporting Requirements</w:t>
+      </w:r>
+      <w:r>
+        <w:rPr>
+          <w:sz w:val="21"/>
+          <w:szCs w:val="21"/>
+        </w:rPr>
+        <w:t xml:space="preserve">, 24 January 2022, https://efis.fma.csc.gov.on.ca/faab/Memos/SB2022/SB01_EN.pdf (accessed on 4 August 2026).</w:t>
       </w:r>
     </w:p>
     <w:p>
@@ -13093,7 +13109,7 @@
           <w:sz w:val="21"/>
           <w:szCs w:val="21"/>
         </w:rPr>
-        <w:t xml:space="preserve">R.I.S.E. Magazine (2025), "China plans to raise rural education standards by employing 7,000 retired teachers", https://www.riseedumag.com/china-plans-to-raise-rural-education-standards-by-employing-7000-retired-teachers/.</w:t>
+        <w:t xml:space="preserve">Ontario Teachers' Pension Plan (2026), "Know your re-employment limit", https://otpp.com/en-ca/members/life-events/living-in-retirement/your-reemployment-limit/ (accessed on 4 August 2026).</w:t>
       </w:r>
     </w:p>
     <w:p>
@@ -13107,23 +13123,7 @@
           <w:sz w:val="21"/>
           <w:szCs w:val="21"/>
         </w:rPr>
-        <w:t xml:space="preserve">Rechnungshof (2025), </w:t>
-      </w:r>
-      <w:r>
-        <w:rPr>
-          <w:i/>
-          <w:iCs/>
-          <w:sz w:val="21"/>
-          <w:szCs w:val="21"/>
-        </w:rPr>
-        <w:t xml:space="preserve">Lehrpersonaleinsatz</w:t>
-      </w:r>
-      <w:r>
-        <w:rPr>
-          <w:sz w:val="21"/>
-          <w:szCs w:val="21"/>
-        </w:rPr>
-        <w:t xml:space="preserve">, Bericht des Rechnungshofes, Reihe Bund 2025/18, Rechnungshof Österreich, Vienna, https://www.rechnungshof.gv.at/rh/home/home/2025_18_Lehrpersonaleinsatz.pdf (accessed on 4 August 2026).</w:t>
+        <w:t xml:space="preserve">OTF (2023), "50-Day re-employment rule increased to 95 days for some OTPP retirees until June 30, 2023", Ontario Teachers' Federation, https://www.otffeo.on.ca/en/news/50-day-re-employment-rule-increased-to-95-days-for-some-otpp-retirees-until-june-30-2023/ (accessed on 4 August 2026).</w:t>
       </w:r>
     </w:p>
     <w:p>
@@ -13137,7 +13137,7 @@
           <w:sz w:val="21"/>
           <w:szCs w:val="21"/>
         </w:rPr>
-        <w:t xml:space="preserve">Renascença (2024), "55 professores aposentados podem dar aulas a partir de janeiro", rr.pt, 19 December 2024, https://rr.pt/noticia/pais/2024/12/19/55-professores-aposentados-podem-dar-aulas-a-partir-de-janeiro/406679/ (accessed on 4 August 2026).</w:t>
+        <w:t xml:space="preserve">R.I.S.E. Magazine (2025), "China plans to raise rural education standards by employing 7,000 retired teachers", https://www.riseedumag.com/china-plans-to-raise-rural-education-standards-by-employing-7000-retired-teachers/.</w:t>
       </w:r>
     </w:p>
     <w:p>
@@ -13151,7 +13151,7 @@
           <w:sz w:val="21"/>
           <w:szCs w:val="21"/>
         </w:rPr>
-        <w:t xml:space="preserve">Resch, K. (2025a), "Retired teachers return to school to tackle teacher shortages in Austrian schools. An untapped reserve or emergency response?", </w:t>
+        <w:t xml:space="preserve">Rechnungshof (2025), </w:t>
       </w:r>
       <w:r>
         <w:rPr>
@@ -13160,14 +13160,14 @@
           <w:sz w:val="21"/>
           <w:szCs w:val="21"/>
         </w:rPr>
-        <w:t xml:space="preserve">European Journal of Teacher Education</w:t>
-      </w:r>
-      <w:r>
-        <w:rPr>
-          <w:sz w:val="21"/>
-          <w:szCs w:val="21"/>
-        </w:rPr>
-        <w:t xml:space="preserve">, advance online publication, 10 July 2025, https://doi.org/10.1080/02619768.2025.2531930 (accessed on 5 August 2026).</w:t>
+        <w:t xml:space="preserve">Lehrpersonaleinsatz</w:t>
+      </w:r>
+      <w:r>
+        <w:rPr>
+          <w:sz w:val="21"/>
+          <w:szCs w:val="21"/>
+        </w:rPr>
+        <w:t xml:space="preserve">, Bericht des Rechnungshofes, Reihe Bund 2025/18, Rechnungshof Österreich, Vienna, https://www.rechnungshof.gv.at/rh/home/home/2025_18_Lehrpersonaleinsatz.pdf (accessed on 4 August 2026).</w:t>
       </w:r>
     </w:p>
     <w:p>
@@ -13181,23 +13181,7 @@
           <w:sz w:val="21"/>
           <w:szCs w:val="21"/>
         </w:rPr>
-        <w:t xml:space="preserve">Resch, K. (2025b), "Die Rückkehr von pensionierten Lehrpersonen in den Schuldienst als berufsbiographisches Ereignis", </w:t>
-      </w:r>
-      <w:r>
-        <w:rPr>
-          <w:i/>
-          <w:iCs/>
-          <w:sz w:val="21"/>
-          <w:szCs w:val="21"/>
-        </w:rPr>
-        <w:t xml:space="preserve">Zeitschrift für Bildungsforschung</w:t>
-      </w:r>
-      <w:r>
-        <w:rPr>
-          <w:sz w:val="21"/>
-          <w:szCs w:val="21"/>
-        </w:rPr>
-        <w:t xml:space="preserve">, published online 12 November 2025, https://doi.org/10.1007/s35834-025-00519-z (accessed on 5 August 2026).</w:t>
+        <w:t xml:space="preserve">Renascença (2024), "55 professores aposentados podem dar aulas a partir de janeiro", rr.pt, 19 December 2024, https://rr.pt/noticia/pais/2024/12/19/55-professores-aposentados-podem-dar-aulas-a-partir-de-janeiro/406679/ (accessed on 4 August 2026).</w:t>
       </w:r>
     </w:p>
     <w:p>
@@ -13211,7 +13195,7 @@
           <w:sz w:val="21"/>
           <w:szCs w:val="21"/>
         </w:rPr>
-        <w:t xml:space="preserve">Rolfhus, E., R. Gersten, B. Clarke, L. E. Decker, C. Wilkins and J. Dimino (2012), </w:t>
+        <w:t xml:space="preserve">Resch, K. (2025a), "Retired teachers return to school to tackle teacher shortages in Austrian schools. An untapped reserve or emergency response?", </w:t>
       </w:r>
       <w:r>
         <w:rPr>
@@ -13220,14 +13204,14 @@
           <w:sz w:val="21"/>
           <w:szCs w:val="21"/>
         </w:rPr>
-        <w:t xml:space="preserve">An Evaluation of Number Rockets: A Tier-2 Intervention for Grade 1 Students at Risk for Difficulties in Mathematics</w:t>
-      </w:r>
-      <w:r>
-        <w:rPr>
-          <w:sz w:val="21"/>
-          <w:szCs w:val="21"/>
-        </w:rPr>
-        <w:t xml:space="preserve"> (NCEE 2012-4007), National Center for Education Evaluation and Regional Assistance, Institute of Education Sciences, Washington, DC, https://eric.ed.gov/?id=ED529429 (accessed on 5 August 2026).</w:t>
+        <w:t xml:space="preserve">European Journal of Teacher Education</w:t>
+      </w:r>
+      <w:r>
+        <w:rPr>
+          <w:sz w:val="21"/>
+          <w:szCs w:val="21"/>
+        </w:rPr>
+        <w:t xml:space="preserve">, advance online publication, 10 July 2025, https://doi.org/10.1080/02619768.2025.2531930 (accessed on 5 August 2026).</w:t>
       </w:r>
     </w:p>
     <w:p>
@@ -13241,7 +13225,23 @@
           <w:sz w:val="21"/>
           <w:szCs w:val="21"/>
         </w:rPr>
-        <w:t xml:space="preserve">RTP (2026), "Professores que adiem reforma recebem 750 euros mas só em escolas onde há carência", rtp.pt, 30 July 2026, https://www.rtp.pt/noticias/pais/professores-que-adiem-reforma-recebem-750-euros-mas-so-em-escolas-onde-ha-carencia_n1756798 (accessed on 4 August 2026).</w:t>
+        <w:t xml:space="preserve">Resch, K. (2025b), "Die Rückkehr von pensionierten Lehrpersonen in den Schuldienst als berufsbiographisches Ereignis", </w:t>
+      </w:r>
+      <w:r>
+        <w:rPr>
+          <w:i/>
+          <w:iCs/>
+          <w:sz w:val="21"/>
+          <w:szCs w:val="21"/>
+        </w:rPr>
+        <w:t xml:space="preserve">Zeitschrift für Bildungsforschung</w:t>
+      </w:r>
+      <w:r>
+        <w:rPr>
+          <w:sz w:val="21"/>
+          <w:szCs w:val="21"/>
+        </w:rPr>
+        <w:t xml:space="preserve">, published online 12 November 2025, https://doi.org/10.1007/s35834-025-00519-z (accessed on 5 August 2026).</w:t>
       </w:r>
     </w:p>
     <w:p>
@@ -13255,7 +13255,23 @@
           <w:sz w:val="21"/>
           <w:szCs w:val="21"/>
         </w:rPr>
-        <w:t xml:space="preserve">SÁBADO (2024), "Continuam a faltar médicos e professores. Porque estão a falhar as medidas do Governo?", sabado.pt, 6 December 2024, https://www.sabado.pt/portugal/detalhe/continuam-a-faltar-medicos-e-professores-porque-falharam-a-medidas-do-governo (accessed on 4 August 2026).</w:t>
+        <w:t xml:space="preserve">Rolfhus, E., R. Gersten, B. Clarke, L. E. Decker, C. Wilkins and J. Dimino (2012), </w:t>
+      </w:r>
+      <w:r>
+        <w:rPr>
+          <w:i/>
+          <w:iCs/>
+          <w:sz w:val="21"/>
+          <w:szCs w:val="21"/>
+        </w:rPr>
+        <w:t xml:space="preserve">An Evaluation of Number Rockets: A Tier-2 Intervention for Grade 1 Students at Risk for Difficulties in Mathematics</w:t>
+      </w:r>
+      <w:r>
+        <w:rPr>
+          <w:sz w:val="21"/>
+          <w:szCs w:val="21"/>
+        </w:rPr>
+        <w:t xml:space="preserve"> (NCEE 2012-4007), National Center for Education Evaluation and Regional Assistance, Institute of Education Sciences, Washington, DC, https://eric.ed.gov/?id=ED529429 (accessed on 5 August 2026).</w:t>
       </w:r>
     </w:p>
     <w:p>
@@ -13269,23 +13285,7 @@
           <w:sz w:val="21"/>
           <w:szCs w:val="21"/>
         </w:rPr>
-        <w:t xml:space="preserve">Sakuma, A. and N. Shimazaki (2024), "'Why are We Running Short of Teachers Even as the Birthrate Declines?': A Case Study of the Teacher Shortage in Public Schools in X Prefecture in Japan", </w:t>
-      </w:r>
-      <w:r>
-        <w:rPr>
-          <w:i/>
-          <w:iCs/>
-          <w:sz w:val="21"/>
-          <w:szCs w:val="21"/>
-        </w:rPr>
-        <w:t xml:space="preserve">Educational Studies in Japan: International Yearbook</w:t>
-      </w:r>
-      <w:r>
-        <w:rPr>
-          <w:sz w:val="21"/>
-          <w:szCs w:val="21"/>
-        </w:rPr>
-        <w:t xml:space="preserve">, No. 18, pp. 191-210, https://files.eric.ed.gov/fulltext/EJ1433887.pdf (accessed on 5 August 2026).</w:t>
+        <w:t xml:space="preserve">RTP (2026), "Professores que adiem reforma recebem 750 euros mas só em escolas onde há carência", rtp.pt, 30 July 2026, https://www.rtp.pt/noticias/pais/professores-que-adiem-reforma-recebem-750-euros-mas-so-em-escolas-onde-ha-carencia_n1756798 (accessed on 4 August 2026).</w:t>
       </w:r>
     </w:p>
     <w:p>
@@ -13299,7 +13299,7 @@
           <w:sz w:val="21"/>
           <w:szCs w:val="21"/>
         </w:rPr>
-        <w:t xml:space="preserve">Scafidi, B., D. L. Sjoquist and T. R. Stinebrickner (2006), "Do Teachers Really Leave for Higher Paying Jobs in Alternative Occupations?", </w:t>
+        <w:t xml:space="preserve">Sakuma, A. and N. Shimazaki (2024), "'Why are We Running Short of Teachers Even as the Birthrate Declines?': A Case Study of the Teacher Shortage in Public Schools in X Prefecture in Japan", </w:t>
       </w:r>
       <w:r>
         <w:rPr>
@@ -13308,14 +13308,14 @@
           <w:sz w:val="21"/>
           <w:szCs w:val="21"/>
         </w:rPr>
-        <w:t xml:space="preserve">The B.E. Journal of Economic Analysis &amp; Policy (Advances)</w:t>
-      </w:r>
-      <w:r>
-        <w:rPr>
-          <w:sz w:val="21"/>
-          <w:szCs w:val="21"/>
-        </w:rPr>
-        <w:t xml:space="preserve">, Vol. 6/1, Article 8, https://ideas.repec.org/a/bpj/bejeap/vadvances.6y2006i1n8.html.</w:t>
+        <w:t xml:space="preserve">Educational Studies in Japan: International Yearbook</w:t>
+      </w:r>
+      <w:r>
+        <w:rPr>
+          <w:sz w:val="21"/>
+          <w:szCs w:val="21"/>
+        </w:rPr>
+        <w:t xml:space="preserve">, No. 18, pp. 191-210, https://files.eric.ed.gov/fulltext/EJ1433887.pdf (accessed on 5 August 2026).</w:t>
       </w:r>
     </w:p>
     <w:p>
@@ -13329,7 +13329,23 @@
           <w:sz w:val="21"/>
           <w:szCs w:val="21"/>
         </w:rPr>
-        <w:t xml:space="preserve">Sims, S. and A. Benhenda (2022), "The effect of financial incentives on the retention of shortage-subject teachers: Evidence from England", CEPEO Working Paper No. 22-04, Centre for Education Policy and Equalising Opportunities, UCL, London, https://repec-cepeo.ucl.ac.uk/cepeow/cepeowp22-04.pdf (accessed on 4 August 2026).</w:t>
+        <w:t xml:space="preserve">Scafidi, B., D. L. Sjoquist and T. R. Stinebrickner (2006), "Do Teachers Really Leave for Higher Paying Jobs in Alternative Occupations?", </w:t>
+      </w:r>
+      <w:r>
+        <w:rPr>
+          <w:i/>
+          <w:iCs/>
+          <w:sz w:val="21"/>
+          <w:szCs w:val="21"/>
+        </w:rPr>
+        <w:t xml:space="preserve">The B.E. Journal of Economic Analysis &amp; Policy (Advances)</w:t>
+      </w:r>
+      <w:r>
+        <w:rPr>
+          <w:sz w:val="21"/>
+          <w:szCs w:val="21"/>
+        </w:rPr>
+        <w:t xml:space="preserve">, Vol. 6/1, Article 8, https://ideas.repec.org/a/bpj/bejeap/vadvances.6y2006i1n8.html.</w:t>
       </w:r>
     </w:p>
     <w:p>
@@ -13343,23 +13359,7 @@
           <w:sz w:val="21"/>
           <w:szCs w:val="21"/>
         </w:rPr>
-        <w:t xml:space="preserve">Sims, S., H. Lowes-Belk and C. Routledge (2026), "Why do people choose to enter and exit the teaching profession? An interdisciplinary quantitative synthesis", </w:t>
-      </w:r>
-      <w:r>
-        <w:rPr>
-          <w:i/>
-          <w:iCs/>
-          <w:sz w:val="21"/>
-          <w:szCs w:val="21"/>
-        </w:rPr>
-        <w:t xml:space="preserve">British Educational Research Journal</w:t>
-      </w:r>
-      <w:r>
-        <w:rPr>
-          <w:sz w:val="21"/>
-          <w:szCs w:val="21"/>
-        </w:rPr>
-        <w:t xml:space="preserve">, Vol. 52/3, pp. 1652-1676, published online 24 October 2025, https://doi.org/10.1002/berj.70027 (accessed on 5 August 2026).</w:t>
+        <w:t xml:space="preserve">Sims, S. and A. Benhenda (2022), "The effect of financial incentives on the retention of shortage-subject teachers: Evidence from England", CEPEO Working Paper No. 22-04, Centre for Education Policy and Equalising Opportunities, UCL, London, https://repec-cepeo.ucl.ac.uk/cepeow/cepeowp22-04.pdf (accessed on 4 August 2026).</w:t>
       </w:r>
     </w:p>
     <w:p>
@@ -13373,7 +13373,7 @@
           <w:sz w:val="21"/>
           <w:szCs w:val="21"/>
         </w:rPr>
-        <w:t xml:space="preserve">Somers, M., L. Fleck, W. Groot and F. van Merode (2024a), </w:t>
+        <w:t xml:space="preserve">Sims, S., H. Lowes-Belk and C. Routledge (2026), "Why do people choose to enter and exit the teaching profession? An interdisciplinary quantitative synthesis", </w:t>
       </w:r>
       <w:r>
         <w:rPr>
@@ -13382,14 +13382,14 @@
           <w:sz w:val="21"/>
           <w:szCs w:val="21"/>
         </w:rPr>
-        <w:t xml:space="preserve">The Hidden Reserve of Nurses and Teachers in the Netherlands</w:t>
-      </w:r>
-      <w:r>
-        <w:rPr>
-          <w:sz w:val="21"/>
-          <w:szCs w:val="21"/>
-        </w:rPr>
-        <w:t xml:space="preserve">, ROA Research Memorandum No. 2024/004E, Research Centre for Education and the Labour Market, Maastricht University, https://doi.org/10.26481/umaror.2024004E (accessed on 4 August 2026).</w:t>
+        <w:t xml:space="preserve">British Educational Research Journal</w:t>
+      </w:r>
+      <w:r>
+        <w:rPr>
+          <w:sz w:val="21"/>
+          <w:szCs w:val="21"/>
+        </w:rPr>
+        <w:t xml:space="preserve">, Vol. 52/3, pp. 1652-1676, published online 24 October 2025, https://doi.org/10.1002/berj.70027 (accessed on 5 August 2026).</w:t>
       </w:r>
     </w:p>
     <w:p>
@@ -13403,7 +13403,7 @@
           <w:sz w:val="21"/>
           <w:szCs w:val="21"/>
         </w:rPr>
-        <w:t xml:space="preserve">Somers, M., W. Groot and F. van Merode (2024b), "Stille reserve voldoende om personeelstekort onderwijs op te lossen", </w:t>
+        <w:t xml:space="preserve">Somers, M., L. Fleck, W. Groot and F. van Merode (2024a), </w:t>
       </w:r>
       <w:r>
         <w:rPr>
@@ -13412,14 +13412,14 @@
           <w:sz w:val="21"/>
           <w:szCs w:val="21"/>
         </w:rPr>
-        <w:t xml:space="preserve">ESB (Economisch Statistische Berichten)</w:t>
-      </w:r>
-      <w:r>
-        <w:rPr>
-          <w:sz w:val="21"/>
-          <w:szCs w:val="21"/>
-        </w:rPr>
-        <w:t xml:space="preserve">, 28 February 2024, https://esb.nu/stille-reserve-voldoende-om-personeelstekort-onderwijs-op-te-lossen/ (accessed on 4 August 2026).</w:t>
+        <w:t xml:space="preserve">The Hidden Reserve of Nurses and Teachers in the Netherlands</w:t>
+      </w:r>
+      <w:r>
+        <w:rPr>
+          <w:sz w:val="21"/>
+          <w:szCs w:val="21"/>
+        </w:rPr>
+        <w:t xml:space="preserve">, ROA Research Memorandum No. 2024/004E, Research Centre for Education and the Labour Market, Maastricht University, https://doi.org/10.26481/umaror.2024004E (accessed on 4 August 2026).</w:t>
       </w:r>
     </w:p>
     <w:p>
@@ -13433,7 +13433,23 @@
           <w:sz w:val="21"/>
           <w:szCs w:val="21"/>
         </w:rPr>
-        <w:t xml:space="preserve">State Council (2023), 教育部教师工作司负责人就《国家银龄教师行动计划》答记者问 [MOE Teacher Affairs Department Q&amp;A on the National Silver Age Teachers Action Plan], www.gov.cn, August 2023, https://www.gov.cn/zhengce/202308/content_6900976.htm.</w:t>
+        <w:t xml:space="preserve">Somers, M., W. Groot and F. van Merode (2024b), "Stille reserve voldoende om personeelstekort onderwijs op te lossen", </w:t>
+      </w:r>
+      <w:r>
+        <w:rPr>
+          <w:i/>
+          <w:iCs/>
+          <w:sz w:val="21"/>
+          <w:szCs w:val="21"/>
+        </w:rPr>
+        <w:t xml:space="preserve">ESB (Economisch Statistische Berichten)</w:t>
+      </w:r>
+      <w:r>
+        <w:rPr>
+          <w:sz w:val="21"/>
+          <w:szCs w:val="21"/>
+        </w:rPr>
+        <w:t xml:space="preserve">, 28 February 2024, https://esb.nu/stille-reserve-voldoende-om-personeelstekort-onderwijs-op-te-lossen/ (accessed on 4 August 2026).</w:t>
       </w:r>
     </w:p>
     <w:p>
@@ -13447,23 +13463,7 @@
           <w:sz w:val="21"/>
           <w:szCs w:val="21"/>
         </w:rPr>
-        <w:t xml:space="preserve">Stinebrickner, T. R. (2002), "An Analysis of Occupational Change and Departure from the Labor Force: Evidence of the Reasons that Teachers Leave", </w:t>
-      </w:r>
-      <w:r>
-        <w:rPr>
-          <w:i/>
-          <w:iCs/>
-          <w:sz w:val="21"/>
-          <w:szCs w:val="21"/>
-        </w:rPr>
-        <w:t xml:space="preserve">Journal of Human Resources</w:t>
-      </w:r>
-      <w:r>
-        <w:rPr>
-          <w:sz w:val="21"/>
-          <w:szCs w:val="21"/>
-        </w:rPr>
-        <w:t xml:space="preserve">, Vol. 37/1, pp. 192-216, https://ideas.repec.org/a/uwp/jhriss/v37y2002i1p192-216.html.</w:t>
+        <w:t xml:space="preserve">State Council (2023), 教育部教师工作司负责人就《国家银龄教师行动计划》答记者问 [MOE Teacher Affairs Department Q&amp;A on the National Silver Age Teachers Action Plan], www.gov.cn, August 2023, https://www.gov.cn/zhengce/202308/content_6900976.htm.</w:t>
       </w:r>
     </w:p>
     <w:p>
@@ -13477,7 +13477,7 @@
           <w:sz w:val="21"/>
           <w:szCs w:val="21"/>
         </w:rPr>
-        <w:t xml:space="preserve">Sutcher, L., L. Darling-Hammond and D. Carver-Thomas (2016), </w:t>
+        <w:t xml:space="preserve">Stinebrickner, T. R. (2002), "An Analysis of Occupational Change and Departure from the Labor Force: Evidence of the Reasons that Teachers Leave", </w:t>
       </w:r>
       <w:r>
         <w:rPr>
@@ -13486,14 +13486,14 @@
           <w:sz w:val="21"/>
           <w:szCs w:val="21"/>
         </w:rPr>
-        <w:t xml:space="preserve">A Coming Crisis in Teaching? Teacher Supply, Demand, and Shortages in the U.S.</w:t>
-      </w:r>
-      <w:r>
-        <w:rPr>
-          <w:sz w:val="21"/>
-          <w:szCs w:val="21"/>
-        </w:rPr>
-        <w:t xml:space="preserve">, Learning Policy Institute, Palo Alto, CA, https://learningpolicyinstitute.org/product/coming-crisis-teaching-brief.</w:t>
+        <w:t xml:space="preserve">Journal of Human Resources</w:t>
+      </w:r>
+      <w:r>
+        <w:rPr>
+          <w:sz w:val="21"/>
+          <w:szCs w:val="21"/>
+        </w:rPr>
+        <w:t xml:space="preserve">, Vol. 37/1, pp. 192-216, https://ideas.repec.org/a/uwp/jhriss/v37y2002i1p192-216.html.</w:t>
       </w:r>
     </w:p>
     <w:p>
@@ -13507,7 +13507,7 @@
           <w:sz w:val="21"/>
           <w:szCs w:val="21"/>
         </w:rPr>
-        <w:t xml:space="preserve">Tan, T., W. Wei, D. Carver-Thomas and E. García (2026), </w:t>
+        <w:t xml:space="preserve">Sutcher, L., L. Darling-Hammond and D. Carver-Thomas (2016), </w:t>
       </w:r>
       <w:r>
         <w:rPr>
@@ -13516,14 +13516,14 @@
           <w:sz w:val="21"/>
           <w:szCs w:val="21"/>
         </w:rPr>
-        <w:t xml:space="preserve">Teacher Turnover in the United States: Who Moves, Who Leaves, and Why</w:t>
-      </w:r>
-      <w:r>
-        <w:rPr>
-          <w:sz w:val="21"/>
-          <w:szCs w:val="21"/>
-        </w:rPr>
-        <w:t xml:space="preserve">, Learning Policy Institute, 17 March 2026, https://doi.org/10.54300/248.479 (report page: https://learningpolicyinstitute.org/product/teacher-turnover-united-states-report) (accessed on 5 August 2026).</w:t>
+        <w:t xml:space="preserve">A Coming Crisis in Teaching? Teacher Supply, Demand, and Shortages in the U.S.</w:t>
+      </w:r>
+      <w:r>
+        <w:rPr>
+          <w:sz w:val="21"/>
+          <w:szCs w:val="21"/>
+        </w:rPr>
+        <w:t xml:space="preserve">, Learning Policy Institute, Palo Alto, CA, https://learningpolicyinstitute.org/product/coming-crisis-teaching-brief.</w:t>
       </w:r>
     </w:p>
     <w:p>
@@ -13537,7 +13537,7 @@
           <w:sz w:val="21"/>
           <w:szCs w:val="21"/>
         </w:rPr>
-        <w:t xml:space="preserve">Teachers' Pensions (n.d.), "Return to work — Once retired", https://www.teacherspensions.co.uk/members/once-retired/return-to-work.aspx (accessed on 5 August 2026).</w:t>
+        <w:t xml:space="preserve">SÁBADO (2024), "Continuam a faltar médicos e professores. Porque estão a falhar as medidas do Governo?", sabado.pt, 6 December 2024, https://www.sabado.pt/portugal/detalhe/continuam-a-faltar-medicos-e-professores-porque-falharam-a-medidas-do-governo (accessed on 4 August 2026).</w:t>
       </w:r>
     </w:p>
     <w:p>
@@ -13551,7 +13551,23 @@
           <w:sz w:val="21"/>
           <w:szCs w:val="21"/>
         </w:rPr>
-        <w:t xml:space="preserve">Teachers Retirement System of Georgia (2026), "Legislative Update", 5 May 2026, https://www.trsga.com/legislation/legislative-update/ (accessed on 4 August 2026).</w:t>
+        <w:t xml:space="preserve">Tan, T., W. Wei, D. Carver-Thomas and E. García (2026), </w:t>
+      </w:r>
+      <w:r>
+        <w:rPr>
+          <w:i/>
+          <w:iCs/>
+          <w:sz w:val="21"/>
+          <w:szCs w:val="21"/>
+        </w:rPr>
+        <w:t xml:space="preserve">Teacher Turnover in the United States: Who Moves, Who Leaves, and Why</w:t>
+      </w:r>
+      <w:r>
+        <w:rPr>
+          <w:sz w:val="21"/>
+          <w:szCs w:val="21"/>
+        </w:rPr>
+        <w:t xml:space="preserve">, Learning Policy Institute, 17 March 2026, https://doi.org/10.54300/248.479 (report page: https://learningpolicyinstitute.org/product/teacher-turnover-united-states-report) (accessed on 5 August 2026).</w:t>
       </w:r>
     </w:p>
     <w:p>
@@ -13565,7 +13581,7 @@
           <w:sz w:val="21"/>
           <w:szCs w:val="21"/>
         </w:rPr>
-        <w:t xml:space="preserve">Teachers' Retirement System of Louisiana (2024), "Regular Session News #18: Governor signs return-to-work bill into law" (Act 394 of 2024, HB 967), 31 May 2024, https://www.trsl.org/resources/legislation/archive/regular-session-news-18-governor-signs-return-to-work-bill-into-law (accessed on 4 August 2026).</w:t>
+        <w:t xml:space="preserve">Teachers Retirement System of Georgia (2026), "Legislative Update", 5 May 2026, https://www.trsga.com/legislation/legislative-update/ (accessed on 4 August 2026).</w:t>
       </w:r>
     </w:p>
     <w:p>
@@ -13579,7 +13595,7 @@
           <w:sz w:val="21"/>
           <w:szCs w:val="21"/>
         </w:rPr>
-        <w:t xml:space="preserve">Teachers' Retirement System of Louisiana (2026), "Regular Session News #18: Passage of return-to-work bill a highlight of 2026" (Act 344 of 2026, SB 14), 2 June 2026, https://www.trsl.org/resources/legislation/archive/regular-session-news-18-passage-of-return-to-work-bill-a-highlight-of-2026-copy (accessed on 4 August 2026).</w:t>
+        <w:t xml:space="preserve">Teachers' Pensions (n.d.), "Return to work — Once retired", https://www.teacherspensions.co.uk/members/once-retired/return-to-work.aspx (accessed on 5 August 2026).</w:t>
       </w:r>
     </w:p>
     <w:p>
@@ -13593,23 +13609,7 @@
           <w:sz w:val="21"/>
           <w:szCs w:val="21"/>
         </w:rPr>
-        <w:t xml:space="preserve">Teaching Council of Aotearoa New Zealand (2026), </w:t>
-      </w:r>
-      <w:r>
-        <w:rPr>
-          <w:i/>
-          <w:iCs/>
-          <w:sz w:val="21"/>
-          <w:szCs w:val="21"/>
-        </w:rPr>
-        <w:t xml:space="preserve">Requirements for Teacher Registration, Practising Certificates and Limited Authority to Teach</w:t>
-      </w:r>
-      <w:r>
-        <w:rPr>
-          <w:sz w:val="21"/>
-          <w:szCs w:val="21"/>
-        </w:rPr>
-        <w:t xml:space="preserve">, registration policy (2026 Teacher Education Refresh update), January 2026 version, Teaching Council of Aotearoa New Zealand, Wellington.</w:t>
+        <w:t xml:space="preserve">Teachers' Retirement System of Louisiana (2024), "Regular Session News #18: Governor signs return-to-work bill into law" (Act 394 of 2024, HB 967), 31 May 2024, https://www.trsl.org/resources/legislation/archive/regular-session-news-18-governor-signs-return-to-work-bill-into-law (accessed on 4 August 2026).</w:t>
       </w:r>
     </w:p>
     <w:p>
@@ -13623,7 +13623,7 @@
           <w:sz w:val="21"/>
           <w:szCs w:val="21"/>
         </w:rPr>
-        <w:t xml:space="preserve">Tweede Kamer (2019), Kamerstukken II 2019/20, 35 300 VIII, nr. 15 (Verslag houdende een lijst van vragen en antwoorden, answer to question 44), https://zoek.officielebekendmakingen.nl/kst-35300-VIII-15.html (accessed on 5 August 2026).</w:t>
+        <w:t xml:space="preserve">Teachers' Retirement System of Louisiana (2026), "Regular Session News #18: Passage of return-to-work bill a highlight of 2026" (Act 344 of 2026, SB 14), 2 June 2026, https://www.trsl.org/resources/legislation/archive/regular-session-news-18-passage-of-return-to-work-bill-a-highlight-of-2026-copy (accessed on 4 August 2026).</w:t>
       </w:r>
     </w:p>
     <w:p>
@@ -13637,7 +13637,23 @@
           <w:sz w:val="21"/>
           <w:szCs w:val="21"/>
         </w:rPr>
-        <w:t xml:space="preserve">UK Parliament (2022), Written question 54668 "Teachers: Re-employment", answered 11 October 2022, https://questions-statements.parliament.uk/written-questions/detail/2022-09-22/54668/ (accessed on 4 August 2026).</w:t>
+        <w:t xml:space="preserve">Teaching Council of Aotearoa New Zealand (2026), </w:t>
+      </w:r>
+      <w:r>
+        <w:rPr>
+          <w:i/>
+          <w:iCs/>
+          <w:sz w:val="21"/>
+          <w:szCs w:val="21"/>
+        </w:rPr>
+        <w:t xml:space="preserve">Requirements for Teacher Registration, Practising Certificates and Limited Authority to Teach</w:t>
+      </w:r>
+      <w:r>
+        <w:rPr>
+          <w:sz w:val="21"/>
+          <w:szCs w:val="21"/>
+        </w:rPr>
+        <w:t xml:space="preserve">, registration policy (2026 Teacher Education Refresh update), January 2026 version, Teaching Council of Aotearoa New Zealand, Wellington.</w:t>
       </w:r>
     </w:p>
     <w:p>
@@ -13651,7 +13667,7 @@
           <w:sz w:val="21"/>
           <w:szCs w:val="21"/>
         </w:rPr>
-        <w:t xml:space="preserve">UK Parliament (2026), "Teacher Workforce", written statement HCWS171, House of Commons, 1 July 2026, https://questions-statements.parliament.uk/written-statements/detail/2026-07-01/hcws171.</w:t>
+        <w:t xml:space="preserve">Tweede Kamer (2019), Kamerstukken II 2019/20, 35 300 VIII, nr. 15 (Verslag houdende een lijst van vragen en antwoorden, answer to question 44), https://zoek.officielebekendmakingen.nl/kst-35300-VIII-15.html (accessed on 5 August 2026).</w:t>
       </w:r>
     </w:p>
     <w:p>
@@ -13665,23 +13681,7 @@
           <w:sz w:val="21"/>
           <w:szCs w:val="21"/>
         </w:rPr>
-        <w:t xml:space="preserve">UNESCO and International Task Force on Teachers for Education 2030 (2024), </w:t>
-      </w:r>
-      <w:r>
-        <w:rPr>
-          <w:i/>
-          <w:iCs/>
-          <w:sz w:val="21"/>
-          <w:szCs w:val="21"/>
-        </w:rPr>
-        <w:t xml:space="preserve">Global Report on Teachers: Addressing Teacher Shortages and Transforming the Profession</w:t>
-      </w:r>
-      <w:r>
-        <w:rPr>
-          <w:sz w:val="21"/>
-          <w:szCs w:val="21"/>
-        </w:rPr>
-        <w:t xml:space="preserve">, UNESCO, Paris, https://www.unesco.org/en/articles/global-report-teachers-addressing-teacher-shortages-and-transforming-profession.</w:t>
+        <w:t xml:space="preserve">UK Parliament (2022), Written question 54668 "Teachers: Re-employment", answered 11 October 2022, https://questions-statements.parliament.uk/written-questions/detail/2022-09-22/54668/ (accessed on 4 August 2026).</w:t>
       </w:r>
     </w:p>
     <w:p>
@@ -13695,23 +13695,7 @@
           <w:sz w:val="21"/>
           <w:szCs w:val="21"/>
         </w:rPr>
-        <w:t xml:space="preserve">Varma, V. R. et al. (2016), "Effect of community volunteering on physical activity: A randomized controlled trial", </w:t>
-      </w:r>
-      <w:r>
-        <w:rPr>
-          <w:i/>
-          <w:iCs/>
-          <w:sz w:val="21"/>
-          <w:szCs w:val="21"/>
-        </w:rPr>
-        <w:t xml:space="preserve">American Journal of Preventive Medicine</w:t>
-      </w:r>
-      <w:r>
-        <w:rPr>
-          <w:sz w:val="21"/>
-          <w:szCs w:val="21"/>
-        </w:rPr>
-        <w:t xml:space="preserve">, Vol. 50/1, pp. 106-110, https://pubmed.ncbi.nlm.nih.gov/26340864/.</w:t>
+        <w:t xml:space="preserve">UK Parliament (2026), "Teacher Workforce", written statement HCWS171, House of Commons, 1 July 2026, https://questions-statements.parliament.uk/written-statements/detail/2026-07-01/hcws171.</w:t>
       </w:r>
     </w:p>
     <w:p>
@@ -13725,7 +13709,23 @@
           <w:sz w:val="21"/>
           <w:szCs w:val="21"/>
         </w:rPr>
-        <w:t xml:space="preserve">Virginia Retirement System (n.d.), "Critical Shortage Positions", https://www.varetire.org/retiree-milestones/working-after-retirement/critical-shortage-positions/ (accessed on 4 August 2026).</w:t>
+        <w:t xml:space="preserve">UNESCO and International Task Force on Teachers for Education 2030 (2024), </w:t>
+      </w:r>
+      <w:r>
+        <w:rPr>
+          <w:i/>
+          <w:iCs/>
+          <w:sz w:val="21"/>
+          <w:szCs w:val="21"/>
+        </w:rPr>
+        <w:t xml:space="preserve">Global Report on Teachers: Addressing Teacher Shortages and Transforming the Profession</w:t>
+      </w:r>
+      <w:r>
+        <w:rPr>
+          <w:sz w:val="21"/>
+          <w:szCs w:val="21"/>
+        </w:rPr>
+        <w:t xml:space="preserve">, UNESCO, Paris, https://www.unesco.org/en/articles/global-report-teachers-addressing-teacher-shortages-and-transforming-profession.</w:t>
       </w:r>
     </w:p>
     <w:p>
@@ -13739,7 +13739,7 @@
           <w:sz w:val="21"/>
           <w:szCs w:val="21"/>
         </w:rPr>
-        <w:t xml:space="preserve">Walker, A. (2022), "DfE scheme to lure back physics teachers recruits just 23 in two years", </w:t>
+        <w:t xml:space="preserve">Varma, V. R. et al. (2016), "Effect of community volunteering on physical activity: A randomized controlled trial", </w:t>
       </w:r>
       <w:r>
         <w:rPr>
@@ -13748,14 +13748,14 @@
           <w:sz w:val="21"/>
           <w:szCs w:val="21"/>
         </w:rPr>
-        <w:t xml:space="preserve">Schools Week</w:t>
-      </w:r>
-      <w:r>
-        <w:rPr>
-          <w:sz w:val="21"/>
-          <w:szCs w:val="21"/>
-        </w:rPr>
-        <w:t xml:space="preserve">, 13 September 2022, https://schoolsweek.co.uk/dfe-scheme-to-lure-back-physics-teachers-recruits-just-23-in-two-years/.</w:t>
+        <w:t xml:space="preserve">American Journal of Preventive Medicine</w:t>
+      </w:r>
+      <w:r>
+        <w:rPr>
+          <w:sz w:val="21"/>
+          <w:szCs w:val="21"/>
+        </w:rPr>
+        <w:t xml:space="preserve">, Vol. 50/1, pp. 106-110, https://pubmed.ncbi.nlm.nih.gov/26340864/.</w:t>
       </w:r>
     </w:p>
     <w:p>
@@ -13769,23 +13769,7 @@
           <w:sz w:val="21"/>
           <w:szCs w:val="21"/>
         </w:rPr>
-        <w:t xml:space="preserve">Watt, H. M. G., P. W. Richardson, U. Klusmann, M. Kunter, B. Beyer, U. Trautwein and J. Baumert (2012), "Motivations for choosing teaching as a career: An international comparison using the FIT-Choice scale", </w:t>
-      </w:r>
-      <w:r>
-        <w:rPr>
-          <w:i/>
-          <w:iCs/>
-          <w:sz w:val="21"/>
-          <w:szCs w:val="21"/>
-        </w:rPr>
-        <w:t xml:space="preserve">Teaching and Teacher Education</w:t>
-      </w:r>
-      <w:r>
-        <w:rPr>
-          <w:sz w:val="21"/>
-          <w:szCs w:val="21"/>
-        </w:rPr>
-        <w:t xml:space="preserve">, Vol. 28/6, pp. 791-805, https://www.sciencedirect.com/science/article/abs/pii/S0742051X12000479.</w:t>
+        <w:t xml:space="preserve">Virginia Retirement System (n.d.), "Critical Shortage Positions", https://www.varetire.org/retiree-milestones/working-after-retirement/critical-shortage-positions/ (accessed on 4 August 2026).</w:t>
       </w:r>
     </w:p>
     <w:p>
@@ -13799,7 +13783,7 @@
           <w:sz w:val="21"/>
           <w:szCs w:val="21"/>
         </w:rPr>
-        <w:t xml:space="preserve">What Works Clearinghouse (2010), </w:t>
+        <w:t xml:space="preserve">Walker, A. (2022), "DfE scheme to lure back physics teachers recruits just 23 in two years", </w:t>
       </w:r>
       <w:r>
         <w:rPr>
@@ -13808,14 +13792,14 @@
           <w:sz w:val="21"/>
           <w:szCs w:val="21"/>
         </w:rPr>
-        <w:t xml:space="preserve">WWC Quick Review of the Report "Evaluation of Experience Corps: Student Reading Outcomes"</w:t>
-      </w:r>
-      <w:r>
-        <w:rPr>
-          <w:sz w:val="21"/>
-          <w:szCs w:val="21"/>
-        </w:rPr>
-        <w:t xml:space="preserve">, Institute of Education Sciences, U.S. Department of Education, Washington, DC, February 2010, https://ies.ed.gov/ncee/wwc/Docs/QuickReview/expcorps_020910.pdf (accessed on 5 August 2026).</w:t>
+        <w:t xml:space="preserve">Schools Week</w:t>
+      </w:r>
+      <w:r>
+        <w:rPr>
+          <w:sz w:val="21"/>
+          <w:szCs w:val="21"/>
+        </w:rPr>
+        <w:t xml:space="preserve">, 13 September 2022, https://schoolsweek.co.uk/dfe-scheme-to-lure-back-physics-teachers-recruits-just-23-in-two-years/.</w:t>
       </w:r>
     </w:p>
     <w:p>
@@ -13829,7 +13813,7 @@
           <w:sz w:val="21"/>
           <w:szCs w:val="21"/>
         </w:rPr>
-        <w:t xml:space="preserve">What Works Clearinghouse (2019), </w:t>
+        <w:t xml:space="preserve">Watt, H. M. G., P. W. Richardson, U. Klusmann, M. Kunter, B. Beyer, U. Trautwein and J. Baumert (2012), "Motivations for choosing teaching as a career: An international comparison using the FIT-Choice scale", </w:t>
       </w:r>
       <w:r>
         <w:rPr>
@@ -13838,14 +13822,14 @@
           <w:sz w:val="21"/>
           <w:szCs w:val="21"/>
         </w:rPr>
-        <w:t xml:space="preserve">Review of Individual Study: DeCesare, McClelland and Randel (2017)</w:t>
-      </w:r>
-      <w:r>
-        <w:rPr>
-          <w:sz w:val="21"/>
-          <w:szCs w:val="21"/>
-        </w:rPr>
-        <w:t xml:space="preserve"> (Study #88756, reviewed August 2019, Standards and Protocol 4.0), Institute of Education Sciences, U.S. Department of Education, Washington, DC, https://ies.ed.gov/ncee/wwc/Study/88756 (accessed on 5 August 2026).</w:t>
+        <w:t xml:space="preserve">Teaching and Teacher Education</w:t>
+      </w:r>
+      <w:r>
+        <w:rPr>
+          <w:sz w:val="21"/>
+          <w:szCs w:val="21"/>
+        </w:rPr>
+        <w:t xml:space="preserve">, Vol. 28/6, pp. 791-805, https://www.sciencedirect.com/science/article/abs/pii/S0742051X12000479.</w:t>
       </w:r>
     </w:p>
     <w:p>
@@ -13859,7 +13843,7 @@
           <w:sz w:val="21"/>
           <w:szCs w:val="21"/>
         </w:rPr>
-        <w:t xml:space="preserve">Will, M. (2022), "Could Retired Teachers Be the Answer to Shortages? It's Complicated", </w:t>
+        <w:t xml:space="preserve">What Works Clearinghouse (2010), </w:t>
       </w:r>
       <w:r>
         <w:rPr>
@@ -13868,14 +13852,14 @@
           <w:sz w:val="21"/>
           <w:szCs w:val="21"/>
         </w:rPr>
-        <w:t xml:space="preserve">Education Week</w:t>
-      </w:r>
-      <w:r>
-        <w:rPr>
-          <w:sz w:val="21"/>
-          <w:szCs w:val="21"/>
-        </w:rPr>
-        <w:t xml:space="preserve">, 11 October 2022, https://www.edweek.org/leadership/could-retired-teachers-be-the-answer-to-shortages-its-complicated/2022/10 (accessed on 4 August 2026).</w:t>
+        <w:t xml:space="preserve">WWC Quick Review of the Report "Evaluation of Experience Corps: Student Reading Outcomes"</w:t>
+      </w:r>
+      <w:r>
+        <w:rPr>
+          <w:sz w:val="21"/>
+          <w:szCs w:val="21"/>
+        </w:rPr>
+        <w:t xml:space="preserve">, Institute of Education Sciences, U.S. Department of Education, Washington, DC, February 2010, https://ies.ed.gov/ncee/wwc/Docs/QuickReview/expcorps_020910.pdf (accessed on 5 August 2026).</w:t>
       </w:r>
     </w:p>
     <w:p>
@@ -13889,7 +13873,7 @@
           <w:sz w:val="21"/>
           <w:szCs w:val="21"/>
         </w:rPr>
-        <w:t xml:space="preserve">Worth, J. (2023), </w:t>
+        <w:t xml:space="preserve">What Works Clearinghouse (2019), </w:t>
       </w:r>
       <w:r>
         <w:rPr>
@@ -13898,14 +13882,14 @@
           <w:sz w:val="21"/>
           <w:szCs w:val="21"/>
         </w:rPr>
-        <w:t xml:space="preserve">Short Supply: Addressing the Post-Pandemic Teacher Supply Challenge in England</w:t>
-      </w:r>
-      <w:r>
-        <w:rPr>
-          <w:sz w:val="21"/>
-          <w:szCs w:val="21"/>
-        </w:rPr>
-        <w:t xml:space="preserve">, National Foundation for Educational Research, Slough, https://files.eric.ed.gov/fulltext/ED627679.pdf (accessed on 4 August 2026).</w:t>
+        <w:t xml:space="preserve">Review of Individual Study: DeCesare, McClelland and Randel (2017)</w:t>
+      </w:r>
+      <w:r>
+        <w:rPr>
+          <w:sz w:val="21"/>
+          <w:szCs w:val="21"/>
+        </w:rPr>
+        <w:t xml:space="preserve"> (Study #88756, reviewed August 2019, Standards and Protocol 4.0), Institute of Education Sciences, U.S. Department of Education, Washington, DC, https://ies.ed.gov/ncee/wwc/Study/88756 (accessed on 5 August 2026).</w:t>
       </w:r>
     </w:p>
     <w:p>
@@ -13919,7 +13903,23 @@
           <w:sz w:val="21"/>
           <w:szCs w:val="21"/>
         </w:rPr>
-        <w:t xml:space="preserve">Worth, J. and C. Sharp (2018), "What do returners want?", NFER blog, 11 July 2018, National Foundation for Educational Research, Slough, https://www.nfer.ac.uk/blogs/what-do-returners-want/ (accessed on 4 August 2026).</w:t>
+        <w:t xml:space="preserve">Will, M. (2022), "Could Retired Teachers Be the Answer to Shortages? It's Complicated", </w:t>
+      </w:r>
+      <w:r>
+        <w:rPr>
+          <w:i/>
+          <w:iCs/>
+          <w:sz w:val="21"/>
+          <w:szCs w:val="21"/>
+        </w:rPr>
+        <w:t xml:space="preserve">Education Week</w:t>
+      </w:r>
+      <w:r>
+        <w:rPr>
+          <w:sz w:val="21"/>
+          <w:szCs w:val="21"/>
+        </w:rPr>
+        <w:t xml:space="preserve">, 11 October 2022, https://www.edweek.org/leadership/could-retired-teachers-be-the-answer-to-shortages-its-complicated/2022/10 (accessed on 4 August 2026).</w:t>
       </w:r>
     </w:p>
     <w:p>
@@ -13933,7 +13933,7 @@
           <w:sz w:val="21"/>
           <w:szCs w:val="21"/>
         </w:rPr>
-        <w:t xml:space="preserve">Worth, J., S. Bamford and B. Durbin (2015), </w:t>
+        <w:t xml:space="preserve">Worth, J. (2023), </w:t>
       </w:r>
       <w:r>
         <w:rPr>
@@ -13942,14 +13942,14 @@
           <w:sz w:val="21"/>
           <w:szCs w:val="21"/>
         </w:rPr>
-        <w:t xml:space="preserve">Should I Stay or Should I Go? NFER Analysis of Teachers Joining and Leaving the Profession</w:t>
-      </w:r>
-      <w:r>
-        <w:rPr>
-          <w:sz w:val="21"/>
-          <w:szCs w:val="21"/>
-        </w:rPr>
-        <w:t xml:space="preserve">, National Foundation for Educational Research, Slough, https://www.nfer.ac.uk/publications/should-i-stay-or-should-i-go-nfer-analysis-of-teachers-joining-and-leaving-the-profession/.</w:t>
+        <w:t xml:space="preserve">Short Supply: Addressing the Post-Pandemic Teacher Supply Challenge in England</w:t>
+      </w:r>
+      <w:r>
+        <w:rPr>
+          <w:sz w:val="21"/>
+          <w:szCs w:val="21"/>
+        </w:rPr>
+        <w:t xml:space="preserve">, National Foundation for Educational Research, Slough, https://files.eric.ed.gov/fulltext/ED627679.pdf (accessed on 4 August 2026).</w:t>
       </w:r>
     </w:p>
     <w:p>
@@ -13963,6 +13963,50 @@
           <w:sz w:val="21"/>
           <w:szCs w:val="21"/>
         </w:rPr>
+        <w:t xml:space="preserve">Worth, J. and C. Sharp (2018), "What do returners want?", NFER blog, 11 July 2018, National Foundation for Educational Research, Slough, https://www.nfer.ac.uk/blogs/what-do-returners-want/ (accessed on 4 August 2026).</w:t>
+      </w:r>
+    </w:p>
+    <w:p>
+      <w:pPr>
+        <w:spacing w:after="120"/>
+        <w:ind w:left="567" w:hanging="567"/>
+        <w:jc w:val="left"/>
+      </w:pPr>
+      <w:r>
+        <w:rPr>
+          <w:sz w:val="21"/>
+          <w:szCs w:val="21"/>
+        </w:rPr>
+        <w:t xml:space="preserve">Worth, J., S. Bamford and B. Durbin (2015), </w:t>
+      </w:r>
+      <w:r>
+        <w:rPr>
+          <w:i/>
+          <w:iCs/>
+          <w:sz w:val="21"/>
+          <w:szCs w:val="21"/>
+        </w:rPr>
+        <w:t xml:space="preserve">Should I Stay or Should I Go? NFER Analysis of Teachers Joining and Leaving the Profession</w:t>
+      </w:r>
+      <w:r>
+        <w:rPr>
+          <w:sz w:val="21"/>
+          <w:szCs w:val="21"/>
+        </w:rPr>
+        <w:t xml:space="preserve">, National Foundation for Educational Research, Slough, https://www.nfer.ac.uk/publications/should-i-stay-or-should-i-go-nfer-analysis-of-teachers-joining-and-leaving-the-profession/.</w:t>
+      </w:r>
+    </w:p>
+    <w:p>
+      <w:pPr>
+        <w:spacing w:after="120"/>
+        <w:ind w:left="567" w:hanging="567"/>
+        <w:jc w:val="left"/>
+      </w:pPr>
+      <w:r>
+        <w:rPr>
+          <w:sz w:val="21"/>
+          <w:szCs w:val="21"/>
+        </w:rPr>
         <w:t xml:space="preserve">ZNS Bahamas (2026), "The Ministry of Education Aiming to Attract More Bahamian Teachers", ZNS Bahamas (Broadcasting Corporation of The Bahamas), 17 July 2026, https://znsbahamas.com/the-ministry-of-education-aiming-to-attract-more-bahamian-teachers/.</w:t>
       </w:r>
     </w:p>
@@ -14014,7 +14058,7 @@
           <w:sz w:val="20"/>
           <w:szCs w:val="20"/>
         </w:rPr>
-        <w:t xml:space="preserve">The leaving rate averaged 7.3% in pre-primary, 5.8% in primary and 5.9% in secondary education. Between 2014/15 and 2022/23 the rate rose by more than two percentage points in Austria, from 3.2% to 6.2%, and in Estonia; it remained below 3% in France, Greece, Ireland and Israel and above 10% in Denmark, Estonia and Lithuania (OECD, 2025a, Table D8.4).</w:t>
+        <w:t xml:space="preserve">The leaving rate averaged 7.3% in pre-primary, 5.8% in primary and 5.9% in secondary education. Between 2013/14 and 2022/23 the rate rose by more than two percentage points in Austria and Estonia (OECD, 2025a, Table D8.4); Austria's rate rose from 3.2% in 2014/15 to 6.2% in 2022/23 (OECD, 2025a, country note). The rate remained below 3% in France, Greece, Ireland and Israel and above 10% in Denmark, Estonia and Lithuania (OECD, 2025a, Table D8.4).</w:t>
       </w:r>
     </w:p>
     <w:p>
@@ -14140,7 +14184,7 @@
           <w:sz w:val="20"/>
           <w:szCs w:val="20"/>
         </w:rPr>
-        <w:t xml:space="preserve">The survey counted 457 000 retired or pensioned teachers in 2021, against an active workforce of roughly 800 000 (Deutsches Schulportal, 2023). &lt;!-- Note for the Section 4 writer: the third verified display table, "Who counts re-entry: the counting body behind each measure's published record" (Table 3.4 in displays_data.md), has deliberately NOT been used in Section 3. It is reserved for the conclusions, where it would carry the accountability/measurement lesson; if used, renumber it Table 5 and rewrite its caption in the EPO finding-as-sentence style, keeping rows byte-intact. --&gt;</w:t>
+        <w:t xml:space="preserve">The survey counted 457 000 retired or pensioned teachers in 2021, against an active workforce of roughly 800 000 (Deutsches Schulportal, 2023).</w:t>
       </w:r>
     </w:p>
     <w:sectPr>

</xml_diff>